<commit_message>
german completed till mid
</commit_message>
<xml_diff>
--- a/8-semester/professional practice/mid/mid note.docx
+++ b/8-semester/professional practice/mid/mid note.docx
@@ -871,7 +871,15 @@
           <w:b/>
           <w:bCs/>
         </w:rPr>
-        <w:t>Service Mark</w:t>
+        <w:t xml:space="preserve">Service </w:t>
+      </w:r>
+      <w:proofErr w:type="spellStart"/>
+      <w:r>
+        <w:rPr>
+          <w:b/>
+          <w:bCs/>
+        </w:rPr>
+        <w:t>Mark</w:t>
       </w:r>
       <w:r>
         <w:rPr>
@@ -881,7 +889,11 @@
         <w:t>:</w:t>
       </w:r>
       <w:r>
-        <w:t>Any word, name, symbol, device, or any combination used to identify and distinguish the services of one provider from services provided by others</w:t>
+        <w:t>Any</w:t>
+      </w:r>
+      <w:proofErr w:type="spellEnd"/>
+      <w:r>
+        <w:t xml:space="preserve"> word, name, symbol, device, or any combination used to identify and distinguish the services of one provider from services provided by others</w:t>
       </w:r>
       <w:r>
         <w:rPr>
@@ -924,7 +936,15 @@
         <w:ind w:left="720"/>
       </w:pPr>
       <w:r>
-        <w:t>having characteristics like geographical origin, ingredients, quality e.g. AGMARK, WOOLMARK Certification mark cannot be used as a trade mark.</w:t>
+        <w:t xml:space="preserve">having characteristics like geographical origin, ingredients, quality </w:t>
+      </w:r>
+      <w:proofErr w:type="gramStart"/>
+      <w:r>
+        <w:t>e.g.</w:t>
+      </w:r>
+      <w:proofErr w:type="gramEnd"/>
+      <w:r>
+        <w:t xml:space="preserve"> AGMARK, WOOLMARK Certification mark cannot be used as a trade mark.</w:t>
       </w:r>
     </w:p>
     <w:p>
@@ -3746,8 +3766,18 @@
           <w:b/>
           <w:bCs/>
         </w:rPr>
-        <w:t>Types of malware</w:t>
-      </w:r>
+        <w:t xml:space="preserve">Types of </w:t>
+      </w:r>
+      <w:proofErr w:type="gramStart"/>
+      <w:r>
+        <w:rPr>
+          <w:rFonts w:asciiTheme="majorBidi" w:hAnsiTheme="majorBidi" w:cstheme="majorBidi"/>
+          <w:b/>
+          <w:bCs/>
+        </w:rPr>
+        <w:t>malware</w:t>
+      </w:r>
+      <w:proofErr w:type="gramEnd"/>
     </w:p>
     <w:p>
       <w:pPr>
@@ -3761,7 +3791,21 @@
         <w:rPr>
           <w:rFonts w:asciiTheme="majorBidi" w:hAnsiTheme="majorBidi" w:cstheme="majorBidi"/>
         </w:rPr>
-        <w:t xml:space="preserve">Different types of malware have the following unique traits and characteristics: </w:t>
+        <w:t xml:space="preserve">Different types of </w:t>
+      </w:r>
+      <w:proofErr w:type="gramStart"/>
+      <w:r>
+        <w:rPr>
+          <w:rFonts w:asciiTheme="majorBidi" w:hAnsiTheme="majorBidi" w:cstheme="majorBidi"/>
+        </w:rPr>
+        <w:t>malware</w:t>
+      </w:r>
+      <w:proofErr w:type="gramEnd"/>
+      <w:r>
+        <w:rPr>
+          <w:rFonts w:asciiTheme="majorBidi" w:hAnsiTheme="majorBidi" w:cstheme="majorBidi"/>
+        </w:rPr>
+        <w:t xml:space="preserve"> have the following unique traits and characteristics: </w:t>
       </w:r>
     </w:p>
     <w:p>
@@ -3970,17 +4014,7 @@
           <w:szCs w:val="32"/>
         </w:rPr>
         <w:lastRenderedPageBreak/>
-        <w:t>S</w:t>
-      </w:r>
-      <w:r>
-        <w:rPr>
-          <w:b/>
-          <w:bCs/>
-          <w:color w:val="000000" w:themeColor="text1"/>
-          <w:sz w:val="32"/>
-          <w:szCs w:val="32"/>
-        </w:rPr>
-        <w:t>tructure of org Part 1</w:t>
+        <w:t>Structure of org Part 1</w:t>
       </w:r>
     </w:p>
     <w:p>
@@ -4048,13 +4082,7 @@
         </w:rPr>
       </w:pPr>
       <w:r>
-        <w:t>Organization should be given a legal existence through a legal process know</w:t>
-      </w:r>
-      <w:r>
-        <w:t>n</w:t>
-      </w:r>
-      <w:r>
-        <w:t xml:space="preserve"> as incorporation.</w:t>
+        <w:t>Organization should be given a legal existence through a legal process known as incorporation.</w:t>
       </w:r>
     </w:p>
     <w:p>
@@ -4818,6 +4846,1023 @@
       <w:r>
         <w:t>companies are typically smaller than corporations. There is also a difference in capital requirements to form a company and to form a corporation.</w:t>
       </w:r>
+    </w:p>
+    <w:p>
+      <w:pPr>
+        <w:pStyle w:val="NormalWeb"/>
+        <w:spacing w:after="0" w:afterAutospacing="0"/>
+        <w:ind w:left="360"/>
+      </w:pPr>
+    </w:p>
+    <w:p>
+      <w:pPr>
+        <w:rPr>
+          <w:rFonts w:ascii="Times New Roman" w:eastAsia="Times New Roman" w:hAnsi="Times New Roman" w:cs="Times New Roman"/>
+          <w:sz w:val="24"/>
+          <w:szCs w:val="24"/>
+          <w:lang w:bidi="ar-SA"/>
+        </w:rPr>
+      </w:pPr>
+      <w:r>
+        <w:br w:type="page"/>
+      </w:r>
+    </w:p>
+    <w:p>
+      <w:pPr>
+        <w:pStyle w:val="Heading3"/>
+        <w:spacing w:after="120" w:afterAutospacing="0"/>
+        <w:jc w:val="center"/>
+        <w:rPr>
+          <w:color w:val="1F1F1F"/>
+          <w:sz w:val="31"/>
+          <w:szCs w:val="31"/>
+        </w:rPr>
+      </w:pPr>
+      <w:r>
+        <w:rPr>
+          <w:color w:val="1F1F1F"/>
+          <w:sz w:val="29"/>
+          <w:szCs w:val="29"/>
+        </w:rPr>
+        <w:lastRenderedPageBreak/>
+        <w:t>Chapter 2 IT issues</w:t>
+      </w:r>
+    </w:p>
+    <w:p>
+      <w:pPr>
+        <w:pStyle w:val="Heading3"/>
+        <w:spacing w:after="120" w:afterAutospacing="0"/>
+        <w:rPr>
+          <w:color w:val="1F1F1F"/>
+        </w:rPr>
+      </w:pPr>
+      <w:r>
+        <w:rPr>
+          <w:color w:val="1F1F1F"/>
+        </w:rPr>
+        <w:t>1. Companies and Their Nature</w:t>
+      </w:r>
+    </w:p>
+    <w:p>
+      <w:pPr>
+        <w:pStyle w:val="NormalWeb"/>
+        <w:numPr>
+          <w:ilvl w:val="0"/>
+          <w:numId w:val="16"/>
+        </w:numPr>
+        <w:spacing w:after="0" w:afterAutospacing="0"/>
+        <w:rPr>
+          <w:color w:val="1F1F1F"/>
+        </w:rPr>
+      </w:pPr>
+      <w:r>
+        <w:rPr>
+          <w:rStyle w:val="citation-254"/>
+          <w:b/>
+          <w:bCs/>
+          <w:color w:val="1F1F1F"/>
+          <w:bdr w:val="none" w:sz="0" w:space="0" w:color="auto" w:frame="1"/>
+        </w:rPr>
+        <w:t>Definition</w:t>
+      </w:r>
+      <w:r>
+        <w:rPr>
+          <w:rStyle w:val="citation-254"/>
+          <w:color w:val="1F1F1F"/>
+          <w:bdr w:val="none" w:sz="0" w:space="0" w:color="auto" w:frame="1"/>
+        </w:rPr>
+        <w:t>: A company is a legal group of people who work together to achieve specific goals by combining their talents and resources</w:t>
+      </w:r>
+      <w:r>
+        <w:rPr>
+          <w:color w:val="1F1F1F"/>
+          <w:bdr w:val="none" w:sz="0" w:space="0" w:color="auto" w:frame="1"/>
+        </w:rPr>
+        <w:t>.</w:t>
+      </w:r>
+    </w:p>
+    <w:p>
+      <w:pPr>
+        <w:pStyle w:val="NormalWeb"/>
+        <w:numPr>
+          <w:ilvl w:val="0"/>
+          <w:numId w:val="16"/>
+        </w:numPr>
+        <w:spacing w:after="0" w:afterAutospacing="0"/>
+        <w:rPr>
+          <w:color w:val="1F1F1F"/>
+        </w:rPr>
+      </w:pPr>
+      <w:r>
+        <w:rPr>
+          <w:rStyle w:val="citation-253"/>
+          <w:b/>
+          <w:bCs/>
+          <w:color w:val="1F1F1F"/>
+          <w:bdr w:val="none" w:sz="0" w:space="0" w:color="auto" w:frame="1"/>
+        </w:rPr>
+        <w:t>Legal Identity</w:t>
+      </w:r>
+      <w:r>
+        <w:rPr>
+          <w:rStyle w:val="citation-253"/>
+          <w:color w:val="1F1F1F"/>
+          <w:bdr w:val="none" w:sz="0" w:space="0" w:color="auto" w:frame="1"/>
+        </w:rPr>
+        <w:t>: A company is treated as its own "legal person," meaning it exists independently from the people who own it</w:t>
+      </w:r>
+      <w:r>
+        <w:rPr>
+          <w:color w:val="1F1F1F"/>
+          <w:bdr w:val="none" w:sz="0" w:space="0" w:color="auto" w:frame="1"/>
+        </w:rPr>
+        <w:t>.</w:t>
+      </w:r>
+    </w:p>
+    <w:p>
+      <w:pPr>
+        <w:pStyle w:val="NormalWeb"/>
+        <w:numPr>
+          <w:ilvl w:val="0"/>
+          <w:numId w:val="16"/>
+        </w:numPr>
+        <w:spacing w:after="0" w:afterAutospacing="0"/>
+        <w:rPr>
+          <w:color w:val="1F1F1F"/>
+        </w:rPr>
+      </w:pPr>
+      <w:r>
+        <w:rPr>
+          <w:b/>
+          <w:bCs/>
+          <w:color w:val="1F1F1F"/>
+          <w:bdr w:val="none" w:sz="0" w:space="0" w:color="auto" w:frame="1"/>
+        </w:rPr>
+        <w:t>Ownership</w:t>
+      </w:r>
+      <w:r>
+        <w:rPr>
+          <w:color w:val="1F1F1F"/>
+          <w:bdr w:val="none" w:sz="0" w:space="0" w:color="auto" w:frame="1"/>
+        </w:rPr>
+        <w:t xml:space="preserve">: Ownership is split into "shares." </w:t>
+      </w:r>
+      <w:r>
+        <w:rPr>
+          <w:rStyle w:val="citation-252"/>
+          <w:color w:val="1F1F1F"/>
+          <w:bdr w:val="none" w:sz="0" w:space="0" w:color="auto" w:frame="1"/>
+        </w:rPr>
+        <w:t xml:space="preserve">People or other companies who own these shares are called </w:t>
+      </w:r>
+      <w:r>
+        <w:rPr>
+          <w:rStyle w:val="citation-252"/>
+          <w:b/>
+          <w:bCs/>
+          <w:color w:val="1F1F1F"/>
+          <w:bdr w:val="none" w:sz="0" w:space="0" w:color="auto" w:frame="1"/>
+        </w:rPr>
+        <w:t>shareholders</w:t>
+      </w:r>
+      <w:r>
+        <w:rPr>
+          <w:rStyle w:val="citation-252"/>
+          <w:color w:val="1F1F1F"/>
+          <w:bdr w:val="none" w:sz="0" w:space="0" w:color="auto" w:frame="1"/>
+        </w:rPr>
+        <w:t xml:space="preserve"> or members</w:t>
+      </w:r>
+      <w:r>
+        <w:rPr>
+          <w:color w:val="1F1F1F"/>
+          <w:bdr w:val="none" w:sz="0" w:space="0" w:color="auto" w:frame="1"/>
+        </w:rPr>
+        <w:t>.</w:t>
+      </w:r>
+    </w:p>
+    <w:p>
+      <w:pPr>
+        <w:pStyle w:val="Heading3"/>
+        <w:spacing w:after="120" w:afterAutospacing="0"/>
+        <w:rPr>
+          <w:color w:val="1F1F1F"/>
+        </w:rPr>
+      </w:pPr>
+      <w:r>
+        <w:rPr>
+          <w:color w:val="1F1F1F"/>
+        </w:rPr>
+        <w:t>2. Types of Companies</w:t>
+      </w:r>
+    </w:p>
+    <w:p>
+      <w:pPr>
+        <w:pStyle w:val="NormalWeb"/>
+        <w:spacing w:after="165" w:afterAutospacing="0"/>
+        <w:rPr>
+          <w:color w:val="1F1F1F"/>
+        </w:rPr>
+      </w:pPr>
+      <w:r>
+        <w:rPr>
+          <w:color w:val="1F1F1F"/>
+        </w:rPr>
+        <w:t>The lecture identifies several ways a company can be structured:</w:t>
+      </w:r>
+    </w:p>
+    <w:p>
+      <w:pPr>
+        <w:pStyle w:val="NormalWeb"/>
+        <w:numPr>
+          <w:ilvl w:val="0"/>
+          <w:numId w:val="17"/>
+        </w:numPr>
+        <w:spacing w:after="0" w:afterAutospacing="0"/>
+        <w:rPr>
+          <w:color w:val="1F1F1F"/>
+        </w:rPr>
+      </w:pPr>
+      <w:r>
+        <w:rPr>
+          <w:b/>
+          <w:bCs/>
+          <w:color w:val="1F1F1F"/>
+          <w:bdr w:val="none" w:sz="0" w:space="0" w:color="auto" w:frame="1"/>
+        </w:rPr>
+        <w:t>Public Company</w:t>
+      </w:r>
+      <w:r>
+        <w:rPr>
+          <w:color w:val="1F1F1F"/>
+          <w:bdr w:val="none" w:sz="0" w:space="0" w:color="auto" w:frame="1"/>
+        </w:rPr>
+        <w:t xml:space="preserve">: These companies can sell shares to the general public. They must have at least 7 shareholders and a minimum starting capital of Rs. </w:t>
+      </w:r>
+      <w:r>
+        <w:rPr>
+          <w:rStyle w:val="citation-251"/>
+          <w:color w:val="1F1F1F"/>
+          <w:bdr w:val="none" w:sz="0" w:space="0" w:color="auto" w:frame="1"/>
+        </w:rPr>
+        <w:t>5 lacs</w:t>
+      </w:r>
+      <w:r>
+        <w:rPr>
+          <w:color w:val="1F1F1F"/>
+          <w:bdr w:val="none" w:sz="0" w:space="0" w:color="auto" w:frame="1"/>
+        </w:rPr>
+        <w:t>.</w:t>
+      </w:r>
+      <w:r>
+        <w:t xml:space="preserve"> </w:t>
+      </w:r>
+      <w:r>
+        <w:rPr>
+          <w:b/>
+          <w:bCs/>
+        </w:rPr>
+        <w:t>Paid-up capital</w:t>
+      </w:r>
+      <w:r>
+        <w:t xml:space="preserve"> is the amount of money a company has received from shareholders in exchange for shares of stock.</w:t>
+      </w:r>
+    </w:p>
+    <w:p>
+      <w:pPr>
+        <w:pStyle w:val="NormalWeb"/>
+        <w:numPr>
+          <w:ilvl w:val="0"/>
+          <w:numId w:val="17"/>
+        </w:numPr>
+        <w:spacing w:after="0" w:afterAutospacing="0"/>
+        <w:rPr>
+          <w:color w:val="1F1F1F"/>
+        </w:rPr>
+      </w:pPr>
+      <w:r>
+        <w:rPr>
+          <w:b/>
+          <w:bCs/>
+          <w:color w:val="1F1F1F"/>
+          <w:bdr w:val="none" w:sz="0" w:space="0" w:color="auto" w:frame="1"/>
+        </w:rPr>
+        <w:t>Private Company</w:t>
+      </w:r>
+      <w:r>
+        <w:rPr>
+          <w:color w:val="1F1F1F"/>
+          <w:bdr w:val="none" w:sz="0" w:space="0" w:color="auto" w:frame="1"/>
+        </w:rPr>
+        <w:t xml:space="preserve">: These are privately owned and cannot offer shares to the public. They require 2 to 200 shareholders and a minimum capital of Rs. </w:t>
+      </w:r>
+      <w:r>
+        <w:rPr>
+          <w:rStyle w:val="citation-250"/>
+          <w:color w:val="1F1F1F"/>
+          <w:bdr w:val="none" w:sz="0" w:space="0" w:color="auto" w:frame="1"/>
+        </w:rPr>
+        <w:t>1 lakh</w:t>
+      </w:r>
+      <w:r>
+        <w:rPr>
+          <w:color w:val="1F1F1F"/>
+          <w:bdr w:val="none" w:sz="0" w:space="0" w:color="auto" w:frame="1"/>
+        </w:rPr>
+        <w:t>.</w:t>
+      </w:r>
+    </w:p>
+    <w:p>
+      <w:pPr>
+        <w:pStyle w:val="NormalWeb"/>
+        <w:numPr>
+          <w:ilvl w:val="0"/>
+          <w:numId w:val="17"/>
+        </w:numPr>
+        <w:spacing w:after="0" w:afterAutospacing="0"/>
+        <w:rPr>
+          <w:color w:val="1F1F1F"/>
+        </w:rPr>
+      </w:pPr>
+      <w:r>
+        <w:rPr>
+          <w:b/>
+          <w:bCs/>
+          <w:color w:val="1F1F1F"/>
+          <w:bdr w:val="none" w:sz="0" w:space="0" w:color="auto" w:frame="1"/>
+        </w:rPr>
+        <w:t>Unlimited Company</w:t>
+      </w:r>
+      <w:r>
+        <w:rPr>
+          <w:color w:val="1F1F1F"/>
+          <w:bdr w:val="none" w:sz="0" w:space="0" w:color="auto" w:frame="1"/>
+        </w:rPr>
+        <w:t xml:space="preserve">: In this rare type, shareholders are personally responsible for all the company's debts. </w:t>
+      </w:r>
+      <w:r>
+        <w:rPr>
+          <w:rStyle w:val="citation-249"/>
+          <w:color w:val="1F1F1F"/>
+          <w:bdr w:val="none" w:sz="0" w:space="0" w:color="auto" w:frame="1"/>
+        </w:rPr>
+        <w:t>If the company owes money, the owners' personal assets can be used to pay it back</w:t>
+      </w:r>
+      <w:r>
+        <w:rPr>
+          <w:color w:val="1F1F1F"/>
+          <w:bdr w:val="none" w:sz="0" w:space="0" w:color="auto" w:frame="1"/>
+        </w:rPr>
+        <w:t>.</w:t>
+      </w:r>
+    </w:p>
+    <w:p>
+      <w:pPr>
+        <w:pStyle w:val="NormalWeb"/>
+        <w:numPr>
+          <w:ilvl w:val="0"/>
+          <w:numId w:val="17"/>
+        </w:numPr>
+        <w:spacing w:after="0" w:afterAutospacing="0"/>
+        <w:rPr>
+          <w:color w:val="1F1F1F"/>
+        </w:rPr>
+      </w:pPr>
+      <w:r>
+        <w:rPr>
+          <w:b/>
+          <w:bCs/>
+          <w:color w:val="1F1F1F"/>
+          <w:bdr w:val="none" w:sz="0" w:space="0" w:color="auto" w:frame="1"/>
+        </w:rPr>
+        <w:t>Limited Company by Guarantee</w:t>
+      </w:r>
+      <w:r>
+        <w:rPr>
+          <w:color w:val="1F1F1F"/>
+          <w:bdr w:val="none" w:sz="0" w:space="0" w:color="auto" w:frame="1"/>
+        </w:rPr>
+        <w:t xml:space="preserve">: Often used by charities or professional bodies. </w:t>
+      </w:r>
+      <w:r>
+        <w:rPr>
+          <w:rStyle w:val="citation-248"/>
+          <w:color w:val="1F1F1F"/>
+          <w:bdr w:val="none" w:sz="0" w:space="0" w:color="auto" w:frame="1"/>
+        </w:rPr>
+        <w:t>Members do not seek profit but "guarantee" to pay a small, fixed amount if the company closes down with debts</w:t>
+      </w:r>
+      <w:r>
+        <w:rPr>
+          <w:color w:val="1F1F1F"/>
+          <w:bdr w:val="none" w:sz="0" w:space="0" w:color="auto" w:frame="1"/>
+        </w:rPr>
+        <w:t>.</w:t>
+      </w:r>
+    </w:p>
+    <w:p>
+      <w:pPr>
+        <w:pStyle w:val="NormalWeb"/>
+        <w:numPr>
+          <w:ilvl w:val="0"/>
+          <w:numId w:val="17"/>
+        </w:numPr>
+        <w:spacing w:after="0" w:afterAutospacing="0"/>
+        <w:rPr>
+          <w:color w:val="1F1F1F"/>
+        </w:rPr>
+      </w:pPr>
+      <w:r>
+        <w:rPr>
+          <w:rStyle w:val="citation-247"/>
+          <w:b/>
+          <w:bCs/>
+          <w:color w:val="1F1F1F"/>
+          <w:bdr w:val="none" w:sz="0" w:space="0" w:color="auto" w:frame="1"/>
+        </w:rPr>
+        <w:t>Limited Company by Shares</w:t>
+      </w:r>
+      <w:r>
+        <w:rPr>
+          <w:rStyle w:val="citation-247"/>
+          <w:color w:val="1F1F1F"/>
+          <w:bdr w:val="none" w:sz="0" w:space="0" w:color="auto" w:frame="1"/>
+        </w:rPr>
+        <w:t>: The most common business structure where a shareholder's financial risk is limited only to the money they invested in their shares</w:t>
+      </w:r>
+      <w:r>
+        <w:rPr>
+          <w:color w:val="1F1F1F"/>
+          <w:bdr w:val="none" w:sz="0" w:space="0" w:color="auto" w:frame="1"/>
+        </w:rPr>
+        <w:t>.</w:t>
+      </w:r>
+    </w:p>
+    <w:p>
+      <w:pPr>
+        <w:pStyle w:val="Heading3"/>
+        <w:spacing w:after="120" w:afterAutospacing="0"/>
+        <w:rPr>
+          <w:color w:val="1F1F1F"/>
+        </w:rPr>
+      </w:pPr>
+      <w:r>
+        <w:rPr>
+          <w:color w:val="1F1F1F"/>
+        </w:rPr>
+        <w:t>3. Computer Contracts</w:t>
+      </w:r>
+      <w:r>
+        <w:rPr>
+          <w:color w:val="1F1F1F"/>
+        </w:rPr>
+        <w:t xml:space="preserve"> </w:t>
+      </w:r>
+    </w:p>
+    <w:p>
+      <w:pPr>
+        <w:pStyle w:val="NormalWeb"/>
+        <w:numPr>
+          <w:ilvl w:val="0"/>
+          <w:numId w:val="18"/>
+        </w:numPr>
+        <w:spacing w:after="0" w:afterAutospacing="0"/>
+        <w:rPr>
+          <w:color w:val="1F1F1F"/>
+        </w:rPr>
+      </w:pPr>
+      <w:r>
+        <w:rPr>
+          <w:rStyle w:val="citation-246"/>
+          <w:b/>
+          <w:bCs/>
+          <w:color w:val="1F1F1F"/>
+          <w:bdr w:val="none" w:sz="0" w:space="0" w:color="auto" w:frame="1"/>
+        </w:rPr>
+        <w:t>Definition</w:t>
+      </w:r>
+      <w:r>
+        <w:rPr>
+          <w:rStyle w:val="citation-246"/>
+          <w:color w:val="1F1F1F"/>
+          <w:bdr w:val="none" w:sz="0" w:space="0" w:color="auto" w:frame="1"/>
+        </w:rPr>
+        <w:t>: A contract is a legally binding promise or agreement between two or more parties that creates specific rights and duties</w:t>
+      </w:r>
+      <w:r>
+        <w:rPr>
+          <w:color w:val="1F1F1F"/>
+          <w:bdr w:val="none" w:sz="0" w:space="0" w:color="auto" w:frame="1"/>
+        </w:rPr>
+        <w:t>.</w:t>
+      </w:r>
+    </w:p>
+    <w:p>
+      <w:pPr>
+        <w:pStyle w:val="NormalWeb"/>
+        <w:numPr>
+          <w:ilvl w:val="0"/>
+          <w:numId w:val="18"/>
+        </w:numPr>
+        <w:spacing w:after="0" w:afterAutospacing="0"/>
+        <w:rPr>
+          <w:color w:val="1F1F1F"/>
+        </w:rPr>
+      </w:pPr>
+      <w:r>
+        <w:rPr>
+          <w:rStyle w:val="citation-245"/>
+          <w:b/>
+          <w:bCs/>
+          <w:color w:val="1F1F1F"/>
+          <w:bdr w:val="none" w:sz="0" w:space="0" w:color="auto" w:frame="1"/>
+        </w:rPr>
+        <w:t>Quality</w:t>
+      </w:r>
+      <w:r>
+        <w:rPr>
+          <w:rStyle w:val="citation-245"/>
+          <w:color w:val="1F1F1F"/>
+          <w:bdr w:val="none" w:sz="0" w:space="0" w:color="auto" w:frame="1"/>
+        </w:rPr>
+        <w:t>: A good contract must be clear, logical, complete, and have no confusing or "ambiguous" parts</w:t>
+      </w:r>
+      <w:r>
+        <w:rPr>
+          <w:color w:val="1F1F1F"/>
+          <w:bdr w:val="none" w:sz="0" w:space="0" w:color="auto" w:frame="1"/>
+        </w:rPr>
+        <w:t>.</w:t>
+      </w:r>
+    </w:p>
+    <w:p>
+      <w:pPr>
+        <w:pStyle w:val="NormalWeb"/>
+        <w:numPr>
+          <w:ilvl w:val="0"/>
+          <w:numId w:val="18"/>
+        </w:numPr>
+        <w:spacing w:after="0" w:afterAutospacing="0"/>
+        <w:rPr>
+          <w:color w:val="1F1F1F"/>
+        </w:rPr>
+      </w:pPr>
+      <w:r>
+        <w:rPr>
+          <w:b/>
+          <w:bCs/>
+          <w:color w:val="1F1F1F"/>
+          <w:bdr w:val="none" w:sz="0" w:space="0" w:color="auto" w:frame="1"/>
+        </w:rPr>
+        <w:t>Common Software Arrangements</w:t>
+      </w:r>
+      <w:r>
+        <w:rPr>
+          <w:color w:val="1F1F1F"/>
+        </w:rPr>
+        <w:t>: The four main ways software services are contracted are:</w:t>
+      </w:r>
+    </w:p>
+    <w:p>
+      <w:pPr>
+        <w:pStyle w:val="NormalWeb"/>
+        <w:numPr>
+          <w:ilvl w:val="1"/>
+          <w:numId w:val="18"/>
+        </w:numPr>
+        <w:spacing w:after="0" w:afterAutospacing="0"/>
+        <w:rPr>
+          <w:color w:val="1F1F1F"/>
+        </w:rPr>
+      </w:pPr>
+      <w:r>
+        <w:rPr>
+          <w:rStyle w:val="citation-244"/>
+          <w:b/>
+          <w:bCs/>
+          <w:color w:val="1F1F1F"/>
+          <w:bdr w:val="none" w:sz="0" w:space="0" w:color="auto" w:frame="1"/>
+        </w:rPr>
+        <w:t>Contract Hire</w:t>
+      </w:r>
+      <w:r>
+        <w:rPr>
+          <w:rStyle w:val="citation-244"/>
+          <w:color w:val="1F1F1F"/>
+          <w:bdr w:val="none" w:sz="0" w:space="0" w:color="auto" w:frame="1"/>
+        </w:rPr>
+        <w:t xml:space="preserve"> </w:t>
+      </w:r>
+    </w:p>
+    <w:p>
+      <w:pPr>
+        <w:pStyle w:val="NormalWeb"/>
+        <w:numPr>
+          <w:ilvl w:val="1"/>
+          <w:numId w:val="18"/>
+        </w:numPr>
+        <w:spacing w:after="0" w:afterAutospacing="0"/>
+        <w:rPr>
+          <w:color w:val="1F1F1F"/>
+        </w:rPr>
+      </w:pPr>
+      <w:r>
+        <w:rPr>
+          <w:rStyle w:val="citation-243"/>
+          <w:b/>
+          <w:bCs/>
+          <w:color w:val="1F1F1F"/>
+          <w:bdr w:val="none" w:sz="0" w:space="0" w:color="auto" w:frame="1"/>
+        </w:rPr>
+        <w:t>Time and Materials</w:t>
+      </w:r>
+      <w:r>
+        <w:rPr>
+          <w:rStyle w:val="citation-243"/>
+          <w:color w:val="1F1F1F"/>
+          <w:bdr w:val="none" w:sz="0" w:space="0" w:color="auto" w:frame="1"/>
+        </w:rPr>
+        <w:t xml:space="preserve"> </w:t>
+      </w:r>
+    </w:p>
+    <w:p>
+      <w:pPr>
+        <w:pStyle w:val="NormalWeb"/>
+        <w:numPr>
+          <w:ilvl w:val="1"/>
+          <w:numId w:val="18"/>
+        </w:numPr>
+        <w:spacing w:after="0" w:afterAutospacing="0"/>
+        <w:rPr>
+          <w:color w:val="1F1F1F"/>
+        </w:rPr>
+      </w:pPr>
+      <w:r>
+        <w:rPr>
+          <w:rStyle w:val="citation-242"/>
+          <w:b/>
+          <w:bCs/>
+          <w:color w:val="1F1F1F"/>
+          <w:bdr w:val="none" w:sz="0" w:space="0" w:color="auto" w:frame="1"/>
+        </w:rPr>
+        <w:t>Consultancy</w:t>
+      </w:r>
+      <w:r>
+        <w:rPr>
+          <w:rStyle w:val="citation-242"/>
+          <w:color w:val="1F1F1F"/>
+          <w:bdr w:val="none" w:sz="0" w:space="0" w:color="auto" w:frame="1"/>
+        </w:rPr>
+        <w:t xml:space="preserve"> </w:t>
+      </w:r>
+    </w:p>
+    <w:p>
+      <w:pPr>
+        <w:pStyle w:val="NormalWeb"/>
+        <w:numPr>
+          <w:ilvl w:val="1"/>
+          <w:numId w:val="18"/>
+        </w:numPr>
+        <w:spacing w:after="0" w:afterAutospacing="0"/>
+        <w:rPr>
+          <w:color w:val="1F1F1F"/>
+        </w:rPr>
+      </w:pPr>
+      <w:r>
+        <w:rPr>
+          <w:rStyle w:val="citation-241"/>
+          <w:b/>
+          <w:bCs/>
+          <w:color w:val="1F1F1F"/>
+          <w:bdr w:val="none" w:sz="0" w:space="0" w:color="auto" w:frame="1"/>
+        </w:rPr>
+        <w:t>Fixed Price</w:t>
+      </w:r>
+      <w:r>
+        <w:rPr>
+          <w:rStyle w:val="citation-241"/>
+          <w:color w:val="1F1F1F"/>
+          <w:bdr w:val="none" w:sz="0" w:space="0" w:color="auto" w:frame="1"/>
+        </w:rPr>
+        <w:t xml:space="preserve"> </w:t>
+      </w:r>
+    </w:p>
+    <w:p>
+      <w:pPr>
+        <w:pStyle w:val="Heading3"/>
+        <w:spacing w:after="120" w:afterAutospacing="0"/>
+        <w:rPr>
+          <w:color w:val="1F1F1F"/>
+        </w:rPr>
+      </w:pPr>
+      <w:r>
+        <w:rPr>
+          <w:color w:val="1F1F1F"/>
+        </w:rPr>
+        <w:t>4. Key Sections of a Software Contract</w:t>
+      </w:r>
+    </w:p>
+    <w:p>
+      <w:pPr>
+        <w:pStyle w:val="NormalWeb"/>
+        <w:spacing w:after="165" w:afterAutospacing="0"/>
+        <w:rPr>
+          <w:color w:val="1F1F1F"/>
+        </w:rPr>
+      </w:pPr>
+      <w:r>
+        <w:rPr>
+          <w:color w:val="1F1F1F"/>
+        </w:rPr>
+        <w:t>When building custom software for a fixed price, the contract usually includes:</w:t>
+      </w:r>
+    </w:p>
+    <w:p>
+      <w:pPr>
+        <w:pStyle w:val="NormalWeb"/>
+        <w:numPr>
+          <w:ilvl w:val="0"/>
+          <w:numId w:val="19"/>
+        </w:numPr>
+        <w:spacing w:after="0" w:afterAutospacing="0"/>
+        <w:rPr>
+          <w:color w:val="1F1F1F"/>
+        </w:rPr>
+      </w:pPr>
+      <w:r>
+        <w:rPr>
+          <w:rStyle w:val="citation-240"/>
+          <w:b/>
+          <w:bCs/>
+          <w:color w:val="1F1F1F"/>
+          <w:bdr w:val="none" w:sz="0" w:space="0" w:color="auto" w:frame="1"/>
+        </w:rPr>
+        <w:lastRenderedPageBreak/>
+        <w:t>Introductory Section</w:t>
+      </w:r>
+      <w:r>
+        <w:rPr>
+          <w:rStyle w:val="citation-240"/>
+          <w:color w:val="1F1F1F"/>
+          <w:bdr w:val="none" w:sz="0" w:space="0" w:color="auto" w:frame="1"/>
+        </w:rPr>
+        <w:t>: Lists the names, addresses, and authorized signatures of the parties involved</w:t>
+      </w:r>
+      <w:r>
+        <w:rPr>
+          <w:color w:val="1F1F1F"/>
+          <w:bdr w:val="none" w:sz="0" w:space="0" w:color="auto" w:frame="1"/>
+        </w:rPr>
+        <w:t>.</w:t>
+      </w:r>
+    </w:p>
+    <w:p>
+      <w:pPr>
+        <w:pStyle w:val="NormalWeb"/>
+        <w:numPr>
+          <w:ilvl w:val="0"/>
+          <w:numId w:val="19"/>
+        </w:numPr>
+        <w:spacing w:after="0" w:afterAutospacing="0"/>
+        <w:rPr>
+          <w:color w:val="1F1F1F"/>
+        </w:rPr>
+      </w:pPr>
+      <w:r>
+        <w:rPr>
+          <w:b/>
+          <w:bCs/>
+          <w:color w:val="1F1F1F"/>
+          <w:bdr w:val="none" w:sz="0" w:space="0" w:color="auto" w:frame="1"/>
+        </w:rPr>
+        <w:t>What is Produced &amp; Delivered</w:t>
+      </w:r>
+      <w:r>
+        <w:rPr>
+          <w:color w:val="1F1F1F"/>
+          <w:bdr w:val="none" w:sz="0" w:space="0" w:color="auto" w:frame="1"/>
+        </w:rPr>
+        <w:t xml:space="preserve">: It must clearly state what is being built. </w:t>
+      </w:r>
+      <w:r>
+        <w:rPr>
+          <w:rStyle w:val="citation-239"/>
+          <w:color w:val="1F1F1F"/>
+          <w:bdr w:val="none" w:sz="0" w:space="0" w:color="auto" w:frame="1"/>
+        </w:rPr>
+        <w:t xml:space="preserve">This isn't just the program; it includes the </w:t>
+      </w:r>
+      <w:r>
+        <w:rPr>
+          <w:rStyle w:val="citation-239"/>
+          <w:b/>
+          <w:bCs/>
+          <w:color w:val="1F1F1F"/>
+          <w:bdr w:val="none" w:sz="0" w:space="0" w:color="auto" w:frame="1"/>
+        </w:rPr>
+        <w:t>source code</w:t>
+      </w:r>
+      <w:r>
+        <w:rPr>
+          <w:rStyle w:val="citation-239"/>
+          <w:color w:val="1F1F1F"/>
+          <w:bdr w:val="none" w:sz="0" w:space="0" w:color="auto" w:frame="1"/>
+        </w:rPr>
+        <w:t>, installation files, design documentation, manuals, and test results</w:t>
+      </w:r>
+      <w:r>
+        <w:rPr>
+          <w:color w:val="1F1F1F"/>
+          <w:bdr w:val="none" w:sz="0" w:space="0" w:color="auto" w:frame="1"/>
+        </w:rPr>
+        <w:t>.</w:t>
+      </w:r>
+    </w:p>
+    <w:p>
+      <w:pPr>
+        <w:pStyle w:val="NormalWeb"/>
+        <w:numPr>
+          <w:ilvl w:val="0"/>
+          <w:numId w:val="19"/>
+        </w:numPr>
+        <w:spacing w:after="0" w:afterAutospacing="0"/>
+        <w:rPr>
+          <w:color w:val="1F1F1F"/>
+        </w:rPr>
+      </w:pPr>
+      <w:r>
+        <w:rPr>
+          <w:rStyle w:val="citation-238"/>
+          <w:b/>
+          <w:bCs/>
+          <w:color w:val="1F1F1F"/>
+          <w:bdr w:val="none" w:sz="0" w:space="0" w:color="auto" w:frame="1"/>
+        </w:rPr>
+        <w:t>Ownership &amp; Confidentiality</w:t>
+      </w:r>
+      <w:r>
+        <w:rPr>
+          <w:rStyle w:val="citation-238"/>
+          <w:color w:val="1F1F1F"/>
+          <w:bdr w:val="none" w:sz="0" w:space="0" w:color="auto" w:frame="1"/>
+        </w:rPr>
+        <w:t>: Defines who legally owns the software rights and ensures that client information is kept private and not shared with others</w:t>
+      </w:r>
+      <w:r>
+        <w:rPr>
+          <w:color w:val="1F1F1F"/>
+          <w:bdr w:val="none" w:sz="0" w:space="0" w:color="auto" w:frame="1"/>
+        </w:rPr>
+        <w:t>.</w:t>
+      </w:r>
+    </w:p>
+    <w:p>
+      <w:pPr>
+        <w:pStyle w:val="NormalWeb"/>
+        <w:numPr>
+          <w:ilvl w:val="0"/>
+          <w:numId w:val="19"/>
+        </w:numPr>
+        <w:spacing w:after="0" w:afterAutospacing="0"/>
+        <w:rPr>
+          <w:color w:val="1F1F1F"/>
+        </w:rPr>
+      </w:pPr>
+      <w:r>
+        <w:rPr>
+          <w:b/>
+          <w:bCs/>
+          <w:color w:val="1F1F1F"/>
+          <w:bdr w:val="none" w:sz="0" w:space="0" w:color="auto" w:frame="1"/>
+        </w:rPr>
+        <w:t>Payment &amp; Penalties</w:t>
+      </w:r>
+      <w:r>
+        <w:rPr>
+          <w:color w:val="1F1F1F"/>
+          <w:bdr w:val="none" w:sz="0" w:space="0" w:color="auto" w:frame="1"/>
+        </w:rPr>
+        <w:t xml:space="preserve">: Specifies when payments are due (usually within 30 days of an invoice). </w:t>
+      </w:r>
+      <w:r>
+        <w:rPr>
+          <w:rStyle w:val="citation-237"/>
+          <w:color w:val="1F1F1F"/>
+          <w:bdr w:val="none" w:sz="0" w:space="0" w:color="auto" w:frame="1"/>
+        </w:rPr>
+        <w:t>If the client pays late, they may face a 2% interest surcharge; if the supplier is late, "penalty clauses" may apply</w:t>
+      </w:r>
+      <w:r>
+        <w:rPr>
+          <w:color w:val="1F1F1F"/>
+          <w:bdr w:val="none" w:sz="0" w:space="0" w:color="auto" w:frame="1"/>
+        </w:rPr>
+        <w:t>.</w:t>
+      </w:r>
+    </w:p>
+    <w:p>
+      <w:pPr>
+        <w:pStyle w:val="NormalWeb"/>
+        <w:numPr>
+          <w:ilvl w:val="0"/>
+          <w:numId w:val="19"/>
+        </w:numPr>
+        <w:spacing w:after="0" w:afterAutospacing="0"/>
+        <w:rPr>
+          <w:color w:val="1F1F1F"/>
+        </w:rPr>
+      </w:pPr>
+      <w:r>
+        <w:rPr>
+          <w:rStyle w:val="citation-236"/>
+          <w:b/>
+          <w:bCs/>
+          <w:color w:val="1F1F1F"/>
+          <w:bdr w:val="none" w:sz="0" w:space="0" w:color="auto" w:frame="1"/>
+        </w:rPr>
+        <w:t>Dispute Resolution</w:t>
+      </w:r>
+      <w:r>
+        <w:rPr>
+          <w:rStyle w:val="citation-236"/>
+          <w:color w:val="1F1F1F"/>
+          <w:bdr w:val="none" w:sz="0" w:space="0" w:color="auto" w:frame="1"/>
+        </w:rPr>
+        <w:t xml:space="preserve">: Mentions </w:t>
+      </w:r>
+      <w:r>
+        <w:rPr>
+          <w:rStyle w:val="citation-236"/>
+          <w:b/>
+          <w:bCs/>
+          <w:color w:val="1F1F1F"/>
+          <w:bdr w:val="none" w:sz="0" w:space="0" w:color="auto" w:frame="1"/>
+        </w:rPr>
+        <w:t>Arbitration</w:t>
+      </w:r>
+      <w:r>
+        <w:rPr>
+          <w:rStyle w:val="citation-236"/>
+          <w:color w:val="1F1F1F"/>
+          <w:bdr w:val="none" w:sz="0" w:space="0" w:color="auto" w:frame="1"/>
+        </w:rPr>
+        <w:t>, which is a way to settle disagreements outside of a courtroom</w:t>
+      </w:r>
+      <w:r>
+        <w:rPr>
+          <w:color w:val="1F1F1F"/>
+          <w:bdr w:val="none" w:sz="0" w:space="0" w:color="auto" w:frame="1"/>
+        </w:rPr>
+        <w:t>.</w:t>
+      </w:r>
+    </w:p>
+    <w:p>
+      <w:pPr>
+        <w:pStyle w:val="NormalWeb"/>
+        <w:numPr>
+          <w:ilvl w:val="0"/>
+          <w:numId w:val="19"/>
+        </w:numPr>
+        <w:spacing w:after="0" w:afterAutospacing="0"/>
+        <w:rPr>
+          <w:color w:val="1F1F1F"/>
+        </w:rPr>
+      </w:pPr>
+      <w:r>
+        <w:rPr>
+          <w:rStyle w:val="citation-235"/>
+          <w:b/>
+          <w:bCs/>
+          <w:color w:val="1F1F1F"/>
+          <w:bdr w:val="none" w:sz="0" w:space="0" w:color="auto" w:frame="1"/>
+        </w:rPr>
+        <w:t>Applicable Law</w:t>
+      </w:r>
+      <w:r>
+        <w:rPr>
+          <w:rStyle w:val="citation-235"/>
+          <w:color w:val="1F1F1F"/>
+          <w:bdr w:val="none" w:sz="0" w:space="0" w:color="auto" w:frame="1"/>
+        </w:rPr>
+        <w:t>: The set of rules and government regulations that the contract must follow</w:t>
+      </w:r>
+      <w:r>
+        <w:rPr>
+          <w:color w:val="1F1F1F"/>
+          <w:bdr w:val="none" w:sz="0" w:space="0" w:color="auto" w:frame="1"/>
+        </w:rPr>
+        <w:t>.</w:t>
+      </w:r>
+    </w:p>
+    <w:p>
+      <w:pPr>
+        <w:pStyle w:val="NormalWeb"/>
+        <w:spacing w:after="0" w:afterAutospacing="0"/>
+        <w:ind w:left="360"/>
+        <w:rPr>
+          <w:color w:val="1F1F1F"/>
+        </w:rPr>
+      </w:pPr>
     </w:p>
     <w:p>
       <w:pPr>
@@ -4841,6 +5886,304 @@
 <file path=word/numbering.xml><?xml version="1.0" encoding="utf-8"?>
 <w:numbering xmlns:wpc="http://schemas.microsoft.com/office/word/2010/wordprocessingCanvas" xmlns:cx="http://schemas.microsoft.com/office/drawing/2014/chartex" xmlns:cx1="http://schemas.microsoft.com/office/drawing/2015/9/8/chartex" xmlns:cx2="http://schemas.microsoft.com/office/drawing/2015/10/21/chartex" xmlns:cx3="http://schemas.microsoft.com/office/drawing/2016/5/9/chartex" xmlns:cx4="http://schemas.microsoft.com/office/drawing/2016/5/10/chartex" xmlns:cx5="http://schemas.microsoft.com/office/drawing/2016/5/11/chartex" xmlns:cx6="http://schemas.microsoft.com/office/drawing/2016/5/12/chartex" xmlns:cx7="http://schemas.microsoft.com/office/drawing/2016/5/13/chartex" xmlns:cx8="http://schemas.microsoft.com/office/drawing/2016/5/14/chartex" xmlns:mc="http://schemas.openxmlformats.org/markup-compatibility/2006" xmlns:aink="http://schemas.microsoft.com/office/drawing/2016/ink" xmlns:am3d="http://schemas.microsoft.com/office/drawing/2017/model3d" xmlns:o="urn:schemas-microsoft-com:office:office" xmlns:r="http://schemas.openxmlformats.org/officeDocument/2006/relationships" xmlns:m="http://schemas.openxmlformats.org/officeDocument/2006/math" xmlns:v="urn:schemas-microsoft-com:vml" xmlns:wp14="http://schemas.microsoft.com/office/word/2010/wordprocessingDrawing" xmlns:wp="http://schemas.openxmlformats.org/drawingml/2006/wordprocessingDrawing" xmlns:w10="urn:schemas-microsoft-com:office:word" xmlns:w="http://schemas.openxmlformats.org/wordprocessingml/2006/main" xmlns:w14="http://schemas.microsoft.com/office/word/2010/wordml" xmlns:w15="http://schemas.microsoft.com/office/word/2012/wordml" xmlns:w16cex="http://schemas.microsoft.com/office/word/2018/wordml/cex" xmlns:w16cid="http://schemas.microsoft.com/office/word/2016/wordml/cid" xmlns:w16="http://schemas.microsoft.com/office/word/2018/wordml" xmlns:w16sdtdh="http://schemas.microsoft.com/office/word/2020/wordml/sdtdatahash" xmlns:w16se="http://schemas.microsoft.com/office/word/2015/wordml/symex" xmlns:wpg="http://schemas.microsoft.com/office/word/2010/wordprocessingGroup" xmlns:wpi="http://schemas.microsoft.com/office/word/2010/wordprocessingInk" xmlns:wne="http://schemas.microsoft.com/office/word/2006/wordml" xmlns:wps="http://schemas.microsoft.com/office/word/2010/wordprocessingShape" mc:Ignorable="w14 w15 w16se w16cid w16 w16cex w16sdtdh wp14">
   <w:abstractNum w:abstractNumId="0" w15:restartNumberingAfterBreak="0">
+    <w:nsid w:val="02511270"/>
+    <w:multiLevelType w:val="multilevel"/>
+    <w:tmpl w:val="B06E0992"/>
+    <w:lvl w:ilvl="0">
+      <w:start w:val="1"/>
+      <w:numFmt w:val="decimal"/>
+      <w:lvlText w:val="%1."/>
+      <w:lvlJc w:val="left"/>
+      <w:pPr>
+        <w:tabs>
+          <w:tab w:val="num" w:pos="720"/>
+        </w:tabs>
+        <w:ind w:left="720" w:hanging="360"/>
+      </w:pPr>
+      <w:rPr>
+        <w:rFonts w:hint="default"/>
+        <w:sz w:val="20"/>
+      </w:rPr>
+    </w:lvl>
+    <w:lvl w:ilvl="1" w:tentative="1">
+      <w:start w:val="1"/>
+      <w:numFmt w:val="bullet"/>
+      <w:lvlText w:val="o"/>
+      <w:lvlJc w:val="left"/>
+      <w:pPr>
+        <w:tabs>
+          <w:tab w:val="num" w:pos="1440"/>
+        </w:tabs>
+        <w:ind w:left="1440" w:hanging="360"/>
+      </w:pPr>
+      <w:rPr>
+        <w:rFonts w:ascii="Courier New" w:hAnsi="Courier New" w:hint="default"/>
+        <w:sz w:val="20"/>
+      </w:rPr>
+    </w:lvl>
+    <w:lvl w:ilvl="2" w:tentative="1">
+      <w:start w:val="1"/>
+      <w:numFmt w:val="bullet"/>
+      <w:lvlText w:val=""/>
+      <w:lvlJc w:val="left"/>
+      <w:pPr>
+        <w:tabs>
+          <w:tab w:val="num" w:pos="2160"/>
+        </w:tabs>
+        <w:ind w:left="2160" w:hanging="360"/>
+      </w:pPr>
+      <w:rPr>
+        <w:rFonts w:ascii="Wingdings" w:hAnsi="Wingdings" w:hint="default"/>
+        <w:sz w:val="20"/>
+      </w:rPr>
+    </w:lvl>
+    <w:lvl w:ilvl="3" w:tentative="1">
+      <w:start w:val="1"/>
+      <w:numFmt w:val="bullet"/>
+      <w:lvlText w:val=""/>
+      <w:lvlJc w:val="left"/>
+      <w:pPr>
+        <w:tabs>
+          <w:tab w:val="num" w:pos="2880"/>
+        </w:tabs>
+        <w:ind w:left="2880" w:hanging="360"/>
+      </w:pPr>
+      <w:rPr>
+        <w:rFonts w:ascii="Wingdings" w:hAnsi="Wingdings" w:hint="default"/>
+        <w:sz w:val="20"/>
+      </w:rPr>
+    </w:lvl>
+    <w:lvl w:ilvl="4" w:tentative="1">
+      <w:start w:val="1"/>
+      <w:numFmt w:val="bullet"/>
+      <w:lvlText w:val=""/>
+      <w:lvlJc w:val="left"/>
+      <w:pPr>
+        <w:tabs>
+          <w:tab w:val="num" w:pos="3600"/>
+        </w:tabs>
+        <w:ind w:left="3600" w:hanging="360"/>
+      </w:pPr>
+      <w:rPr>
+        <w:rFonts w:ascii="Wingdings" w:hAnsi="Wingdings" w:hint="default"/>
+        <w:sz w:val="20"/>
+      </w:rPr>
+    </w:lvl>
+    <w:lvl w:ilvl="5" w:tentative="1">
+      <w:start w:val="1"/>
+      <w:numFmt w:val="bullet"/>
+      <w:lvlText w:val=""/>
+      <w:lvlJc w:val="left"/>
+      <w:pPr>
+        <w:tabs>
+          <w:tab w:val="num" w:pos="4320"/>
+        </w:tabs>
+        <w:ind w:left="4320" w:hanging="360"/>
+      </w:pPr>
+      <w:rPr>
+        <w:rFonts w:ascii="Wingdings" w:hAnsi="Wingdings" w:hint="default"/>
+        <w:sz w:val="20"/>
+      </w:rPr>
+    </w:lvl>
+    <w:lvl w:ilvl="6" w:tentative="1">
+      <w:start w:val="1"/>
+      <w:numFmt w:val="bullet"/>
+      <w:lvlText w:val=""/>
+      <w:lvlJc w:val="left"/>
+      <w:pPr>
+        <w:tabs>
+          <w:tab w:val="num" w:pos="5040"/>
+        </w:tabs>
+        <w:ind w:left="5040" w:hanging="360"/>
+      </w:pPr>
+      <w:rPr>
+        <w:rFonts w:ascii="Wingdings" w:hAnsi="Wingdings" w:hint="default"/>
+        <w:sz w:val="20"/>
+      </w:rPr>
+    </w:lvl>
+    <w:lvl w:ilvl="7" w:tentative="1">
+      <w:start w:val="1"/>
+      <w:numFmt w:val="bullet"/>
+      <w:lvlText w:val=""/>
+      <w:lvlJc w:val="left"/>
+      <w:pPr>
+        <w:tabs>
+          <w:tab w:val="num" w:pos="5760"/>
+        </w:tabs>
+        <w:ind w:left="5760" w:hanging="360"/>
+      </w:pPr>
+      <w:rPr>
+        <w:rFonts w:ascii="Wingdings" w:hAnsi="Wingdings" w:hint="default"/>
+        <w:sz w:val="20"/>
+      </w:rPr>
+    </w:lvl>
+    <w:lvl w:ilvl="8" w:tentative="1">
+      <w:start w:val="1"/>
+      <w:numFmt w:val="bullet"/>
+      <w:lvlText w:val=""/>
+      <w:lvlJc w:val="left"/>
+      <w:pPr>
+        <w:tabs>
+          <w:tab w:val="num" w:pos="6480"/>
+        </w:tabs>
+        <w:ind w:left="6480" w:hanging="360"/>
+      </w:pPr>
+      <w:rPr>
+        <w:rFonts w:ascii="Wingdings" w:hAnsi="Wingdings" w:hint="default"/>
+        <w:sz w:val="20"/>
+      </w:rPr>
+    </w:lvl>
+  </w:abstractNum>
+  <w:abstractNum w:abstractNumId="1" w15:restartNumberingAfterBreak="0">
+    <w:nsid w:val="133F0A63"/>
+    <w:multiLevelType w:val="multilevel"/>
+    <w:tmpl w:val="7408F348"/>
+    <w:lvl w:ilvl="0">
+      <w:start w:val="1"/>
+      <w:numFmt w:val="bullet"/>
+      <w:lvlText w:val=""/>
+      <w:lvlJc w:val="left"/>
+      <w:pPr>
+        <w:tabs>
+          <w:tab w:val="num" w:pos="720"/>
+        </w:tabs>
+        <w:ind w:left="720" w:hanging="360"/>
+      </w:pPr>
+      <w:rPr>
+        <w:rFonts w:ascii="Symbol" w:hAnsi="Symbol" w:hint="default"/>
+        <w:sz w:val="20"/>
+      </w:rPr>
+    </w:lvl>
+    <w:lvl w:ilvl="1" w:tentative="1">
+      <w:start w:val="1"/>
+      <w:numFmt w:val="bullet"/>
+      <w:lvlText w:val="o"/>
+      <w:lvlJc w:val="left"/>
+      <w:pPr>
+        <w:tabs>
+          <w:tab w:val="num" w:pos="1440"/>
+        </w:tabs>
+        <w:ind w:left="1440" w:hanging="360"/>
+      </w:pPr>
+      <w:rPr>
+        <w:rFonts w:ascii="Courier New" w:hAnsi="Courier New" w:hint="default"/>
+        <w:sz w:val="20"/>
+      </w:rPr>
+    </w:lvl>
+    <w:lvl w:ilvl="2" w:tentative="1">
+      <w:start w:val="1"/>
+      <w:numFmt w:val="bullet"/>
+      <w:lvlText w:val=""/>
+      <w:lvlJc w:val="left"/>
+      <w:pPr>
+        <w:tabs>
+          <w:tab w:val="num" w:pos="2160"/>
+        </w:tabs>
+        <w:ind w:left="2160" w:hanging="360"/>
+      </w:pPr>
+      <w:rPr>
+        <w:rFonts w:ascii="Wingdings" w:hAnsi="Wingdings" w:hint="default"/>
+        <w:sz w:val="20"/>
+      </w:rPr>
+    </w:lvl>
+    <w:lvl w:ilvl="3" w:tentative="1">
+      <w:start w:val="1"/>
+      <w:numFmt w:val="bullet"/>
+      <w:lvlText w:val=""/>
+      <w:lvlJc w:val="left"/>
+      <w:pPr>
+        <w:tabs>
+          <w:tab w:val="num" w:pos="2880"/>
+        </w:tabs>
+        <w:ind w:left="2880" w:hanging="360"/>
+      </w:pPr>
+      <w:rPr>
+        <w:rFonts w:ascii="Wingdings" w:hAnsi="Wingdings" w:hint="default"/>
+        <w:sz w:val="20"/>
+      </w:rPr>
+    </w:lvl>
+    <w:lvl w:ilvl="4" w:tentative="1">
+      <w:start w:val="1"/>
+      <w:numFmt w:val="bullet"/>
+      <w:lvlText w:val=""/>
+      <w:lvlJc w:val="left"/>
+      <w:pPr>
+        <w:tabs>
+          <w:tab w:val="num" w:pos="3600"/>
+        </w:tabs>
+        <w:ind w:left="3600" w:hanging="360"/>
+      </w:pPr>
+      <w:rPr>
+        <w:rFonts w:ascii="Wingdings" w:hAnsi="Wingdings" w:hint="default"/>
+        <w:sz w:val="20"/>
+      </w:rPr>
+    </w:lvl>
+    <w:lvl w:ilvl="5" w:tentative="1">
+      <w:start w:val="1"/>
+      <w:numFmt w:val="bullet"/>
+      <w:lvlText w:val=""/>
+      <w:lvlJc w:val="left"/>
+      <w:pPr>
+        <w:tabs>
+          <w:tab w:val="num" w:pos="4320"/>
+        </w:tabs>
+        <w:ind w:left="4320" w:hanging="360"/>
+      </w:pPr>
+      <w:rPr>
+        <w:rFonts w:ascii="Wingdings" w:hAnsi="Wingdings" w:hint="default"/>
+        <w:sz w:val="20"/>
+      </w:rPr>
+    </w:lvl>
+    <w:lvl w:ilvl="6" w:tentative="1">
+      <w:start w:val="1"/>
+      <w:numFmt w:val="bullet"/>
+      <w:lvlText w:val=""/>
+      <w:lvlJc w:val="left"/>
+      <w:pPr>
+        <w:tabs>
+          <w:tab w:val="num" w:pos="5040"/>
+        </w:tabs>
+        <w:ind w:left="5040" w:hanging="360"/>
+      </w:pPr>
+      <w:rPr>
+        <w:rFonts w:ascii="Wingdings" w:hAnsi="Wingdings" w:hint="default"/>
+        <w:sz w:val="20"/>
+      </w:rPr>
+    </w:lvl>
+    <w:lvl w:ilvl="7" w:tentative="1">
+      <w:start w:val="1"/>
+      <w:numFmt w:val="bullet"/>
+      <w:lvlText w:val=""/>
+      <w:lvlJc w:val="left"/>
+      <w:pPr>
+        <w:tabs>
+          <w:tab w:val="num" w:pos="5760"/>
+        </w:tabs>
+        <w:ind w:left="5760" w:hanging="360"/>
+      </w:pPr>
+      <w:rPr>
+        <w:rFonts w:ascii="Wingdings" w:hAnsi="Wingdings" w:hint="default"/>
+        <w:sz w:val="20"/>
+      </w:rPr>
+    </w:lvl>
+    <w:lvl w:ilvl="8" w:tentative="1">
+      <w:start w:val="1"/>
+      <w:numFmt w:val="bullet"/>
+      <w:lvlText w:val=""/>
+      <w:lvlJc w:val="left"/>
+      <w:pPr>
+        <w:tabs>
+          <w:tab w:val="num" w:pos="6480"/>
+        </w:tabs>
+        <w:ind w:left="6480" w:hanging="360"/>
+      </w:pPr>
+      <w:rPr>
+        <w:rFonts w:ascii="Wingdings" w:hAnsi="Wingdings" w:hint="default"/>
+        <w:sz w:val="20"/>
+      </w:rPr>
+    </w:lvl>
+  </w:abstractNum>
+  <w:abstractNum w:abstractNumId="2" w15:restartNumberingAfterBreak="0">
     <w:nsid w:val="1DD64688"/>
     <w:multiLevelType w:val="multilevel"/>
     <w:tmpl w:val="21785EB2"/>
@@ -4989,7 +6332,7 @@
       </w:rPr>
     </w:lvl>
   </w:abstractNum>
-  <w:abstractNum w:abstractNumId="1" w15:restartNumberingAfterBreak="0">
+  <w:abstractNum w:abstractNumId="3" w15:restartNumberingAfterBreak="0">
     <w:nsid w:val="1F67761A"/>
     <w:multiLevelType w:val="multilevel"/>
     <w:tmpl w:val="833E5392"/>
@@ -5138,7 +6481,7 @@
       </w:rPr>
     </w:lvl>
   </w:abstractNum>
-  <w:abstractNum w:abstractNumId="2" w15:restartNumberingAfterBreak="0">
+  <w:abstractNum w:abstractNumId="4" w15:restartNumberingAfterBreak="0">
     <w:nsid w:val="1F9A0E31"/>
     <w:multiLevelType w:val="multilevel"/>
     <w:tmpl w:val="23D6256A"/>
@@ -5288,7 +6631,7 @@
       </w:rPr>
     </w:lvl>
   </w:abstractNum>
-  <w:abstractNum w:abstractNumId="3" w15:restartNumberingAfterBreak="0">
+  <w:abstractNum w:abstractNumId="5" w15:restartNumberingAfterBreak="0">
     <w:nsid w:val="272574CB"/>
     <w:multiLevelType w:val="multilevel"/>
     <w:tmpl w:val="AC08261E"/>
@@ -5437,7 +6780,7 @@
       </w:rPr>
     </w:lvl>
   </w:abstractNum>
-  <w:abstractNum w:abstractNumId="4" w15:restartNumberingAfterBreak="0">
+  <w:abstractNum w:abstractNumId="6" w15:restartNumberingAfterBreak="0">
     <w:nsid w:val="27E11122"/>
     <w:multiLevelType w:val="hybridMultilevel"/>
     <w:tmpl w:val="7DDCF25A"/>
@@ -5527,7 +6870,7 @@
       </w:pPr>
     </w:lvl>
   </w:abstractNum>
-  <w:abstractNum w:abstractNumId="5" w15:restartNumberingAfterBreak="0">
+  <w:abstractNum w:abstractNumId="7" w15:restartNumberingAfterBreak="0">
     <w:nsid w:val="2C667633"/>
     <w:multiLevelType w:val="multilevel"/>
     <w:tmpl w:val="3CA00FBC"/>
@@ -5671,7 +7014,7 @@
       </w:rPr>
     </w:lvl>
   </w:abstractNum>
-  <w:abstractNum w:abstractNumId="6" w15:restartNumberingAfterBreak="0">
+  <w:abstractNum w:abstractNumId="8" w15:restartNumberingAfterBreak="0">
     <w:nsid w:val="2E2B5330"/>
     <w:multiLevelType w:val="multilevel"/>
     <w:tmpl w:val="833E5392"/>
@@ -5820,7 +7163,7 @@
       </w:rPr>
     </w:lvl>
   </w:abstractNum>
-  <w:abstractNum w:abstractNumId="7" w15:restartNumberingAfterBreak="0">
+  <w:abstractNum w:abstractNumId="9" w15:restartNumberingAfterBreak="0">
     <w:nsid w:val="2F730CCC"/>
     <w:multiLevelType w:val="multilevel"/>
     <w:tmpl w:val="833E5392"/>
@@ -5969,7 +7312,7 @@
       </w:rPr>
     </w:lvl>
   </w:abstractNum>
-  <w:abstractNum w:abstractNumId="8" w15:restartNumberingAfterBreak="0">
+  <w:abstractNum w:abstractNumId="10" w15:restartNumberingAfterBreak="0">
     <w:nsid w:val="32760B7B"/>
     <w:multiLevelType w:val="multilevel"/>
     <w:tmpl w:val="1E5278AE"/>
@@ -6118,7 +7461,7 @@
       </w:rPr>
     </w:lvl>
   </w:abstractNum>
-  <w:abstractNum w:abstractNumId="9" w15:restartNumberingAfterBreak="0">
+  <w:abstractNum w:abstractNumId="11" w15:restartNumberingAfterBreak="0">
     <w:nsid w:val="34847923"/>
     <w:multiLevelType w:val="multilevel"/>
     <w:tmpl w:val="F536B5A0"/>
@@ -6267,7 +7610,7 @@
       </w:rPr>
     </w:lvl>
   </w:abstractNum>
-  <w:abstractNum w:abstractNumId="10" w15:restartNumberingAfterBreak="0">
+  <w:abstractNum w:abstractNumId="12" w15:restartNumberingAfterBreak="0">
     <w:nsid w:val="36580F56"/>
     <w:multiLevelType w:val="multilevel"/>
     <w:tmpl w:val="155A91C2"/>
@@ -6416,7 +7759,7 @@
       </w:rPr>
     </w:lvl>
   </w:abstractNum>
-  <w:abstractNum w:abstractNumId="11" w15:restartNumberingAfterBreak="0">
+  <w:abstractNum w:abstractNumId="13" w15:restartNumberingAfterBreak="0">
     <w:nsid w:val="39ED6BB6"/>
     <w:multiLevelType w:val="multilevel"/>
     <w:tmpl w:val="D966B664"/>
@@ -6565,7 +7908,7 @@
       </w:rPr>
     </w:lvl>
   </w:abstractNum>
-  <w:abstractNum w:abstractNumId="12" w15:restartNumberingAfterBreak="0">
+  <w:abstractNum w:abstractNumId="14" w15:restartNumberingAfterBreak="0">
     <w:nsid w:val="3C8863E9"/>
     <w:multiLevelType w:val="multilevel"/>
     <w:tmpl w:val="F8AA4B8E"/>
@@ -6714,7 +8057,7 @@
       </w:rPr>
     </w:lvl>
   </w:abstractNum>
-  <w:abstractNum w:abstractNumId="13" w15:restartNumberingAfterBreak="0">
+  <w:abstractNum w:abstractNumId="15" w15:restartNumberingAfterBreak="0">
     <w:nsid w:val="49A57403"/>
     <w:multiLevelType w:val="multilevel"/>
     <w:tmpl w:val="833E5392"/>
@@ -6863,7 +8206,301 @@
       </w:rPr>
     </w:lvl>
   </w:abstractNum>
-  <w:abstractNum w:abstractNumId="14" w15:restartNumberingAfterBreak="0">
+  <w:abstractNum w:abstractNumId="16" w15:restartNumberingAfterBreak="0">
+    <w:nsid w:val="65CA380A"/>
+    <w:multiLevelType w:val="multilevel"/>
+    <w:tmpl w:val="40EE4A18"/>
+    <w:lvl w:ilvl="0">
+      <w:start w:val="1"/>
+      <w:numFmt w:val="bullet"/>
+      <w:lvlText w:val=""/>
+      <w:lvlJc w:val="left"/>
+      <w:pPr>
+        <w:tabs>
+          <w:tab w:val="num" w:pos="720"/>
+        </w:tabs>
+        <w:ind w:left="720" w:hanging="360"/>
+      </w:pPr>
+      <w:rPr>
+        <w:rFonts w:ascii="Symbol" w:hAnsi="Symbol" w:hint="default"/>
+        <w:sz w:val="20"/>
+      </w:rPr>
+    </w:lvl>
+    <w:lvl w:ilvl="1" w:tentative="1">
+      <w:start w:val="1"/>
+      <w:numFmt w:val="bullet"/>
+      <w:lvlText w:val="o"/>
+      <w:lvlJc w:val="left"/>
+      <w:pPr>
+        <w:tabs>
+          <w:tab w:val="num" w:pos="1440"/>
+        </w:tabs>
+        <w:ind w:left="1440" w:hanging="360"/>
+      </w:pPr>
+      <w:rPr>
+        <w:rFonts w:ascii="Courier New" w:hAnsi="Courier New" w:hint="default"/>
+        <w:sz w:val="20"/>
+      </w:rPr>
+    </w:lvl>
+    <w:lvl w:ilvl="2" w:tentative="1">
+      <w:start w:val="1"/>
+      <w:numFmt w:val="bullet"/>
+      <w:lvlText w:val=""/>
+      <w:lvlJc w:val="left"/>
+      <w:pPr>
+        <w:tabs>
+          <w:tab w:val="num" w:pos="2160"/>
+        </w:tabs>
+        <w:ind w:left="2160" w:hanging="360"/>
+      </w:pPr>
+      <w:rPr>
+        <w:rFonts w:ascii="Wingdings" w:hAnsi="Wingdings" w:hint="default"/>
+        <w:sz w:val="20"/>
+      </w:rPr>
+    </w:lvl>
+    <w:lvl w:ilvl="3" w:tentative="1">
+      <w:start w:val="1"/>
+      <w:numFmt w:val="bullet"/>
+      <w:lvlText w:val=""/>
+      <w:lvlJc w:val="left"/>
+      <w:pPr>
+        <w:tabs>
+          <w:tab w:val="num" w:pos="2880"/>
+        </w:tabs>
+        <w:ind w:left="2880" w:hanging="360"/>
+      </w:pPr>
+      <w:rPr>
+        <w:rFonts w:ascii="Wingdings" w:hAnsi="Wingdings" w:hint="default"/>
+        <w:sz w:val="20"/>
+      </w:rPr>
+    </w:lvl>
+    <w:lvl w:ilvl="4" w:tentative="1">
+      <w:start w:val="1"/>
+      <w:numFmt w:val="bullet"/>
+      <w:lvlText w:val=""/>
+      <w:lvlJc w:val="left"/>
+      <w:pPr>
+        <w:tabs>
+          <w:tab w:val="num" w:pos="3600"/>
+        </w:tabs>
+        <w:ind w:left="3600" w:hanging="360"/>
+      </w:pPr>
+      <w:rPr>
+        <w:rFonts w:ascii="Wingdings" w:hAnsi="Wingdings" w:hint="default"/>
+        <w:sz w:val="20"/>
+      </w:rPr>
+    </w:lvl>
+    <w:lvl w:ilvl="5" w:tentative="1">
+      <w:start w:val="1"/>
+      <w:numFmt w:val="bullet"/>
+      <w:lvlText w:val=""/>
+      <w:lvlJc w:val="left"/>
+      <w:pPr>
+        <w:tabs>
+          <w:tab w:val="num" w:pos="4320"/>
+        </w:tabs>
+        <w:ind w:left="4320" w:hanging="360"/>
+      </w:pPr>
+      <w:rPr>
+        <w:rFonts w:ascii="Wingdings" w:hAnsi="Wingdings" w:hint="default"/>
+        <w:sz w:val="20"/>
+      </w:rPr>
+    </w:lvl>
+    <w:lvl w:ilvl="6" w:tentative="1">
+      <w:start w:val="1"/>
+      <w:numFmt w:val="bullet"/>
+      <w:lvlText w:val=""/>
+      <w:lvlJc w:val="left"/>
+      <w:pPr>
+        <w:tabs>
+          <w:tab w:val="num" w:pos="5040"/>
+        </w:tabs>
+        <w:ind w:left="5040" w:hanging="360"/>
+      </w:pPr>
+      <w:rPr>
+        <w:rFonts w:ascii="Wingdings" w:hAnsi="Wingdings" w:hint="default"/>
+        <w:sz w:val="20"/>
+      </w:rPr>
+    </w:lvl>
+    <w:lvl w:ilvl="7" w:tentative="1">
+      <w:start w:val="1"/>
+      <w:numFmt w:val="bullet"/>
+      <w:lvlText w:val=""/>
+      <w:lvlJc w:val="left"/>
+      <w:pPr>
+        <w:tabs>
+          <w:tab w:val="num" w:pos="5760"/>
+        </w:tabs>
+        <w:ind w:left="5760" w:hanging="360"/>
+      </w:pPr>
+      <w:rPr>
+        <w:rFonts w:ascii="Wingdings" w:hAnsi="Wingdings" w:hint="default"/>
+        <w:sz w:val="20"/>
+      </w:rPr>
+    </w:lvl>
+    <w:lvl w:ilvl="8" w:tentative="1">
+      <w:start w:val="1"/>
+      <w:numFmt w:val="bullet"/>
+      <w:lvlText w:val=""/>
+      <w:lvlJc w:val="left"/>
+      <w:pPr>
+        <w:tabs>
+          <w:tab w:val="num" w:pos="6480"/>
+        </w:tabs>
+        <w:ind w:left="6480" w:hanging="360"/>
+      </w:pPr>
+      <w:rPr>
+        <w:rFonts w:ascii="Wingdings" w:hAnsi="Wingdings" w:hint="default"/>
+        <w:sz w:val="20"/>
+      </w:rPr>
+    </w:lvl>
+  </w:abstractNum>
+  <w:abstractNum w:abstractNumId="17" w15:restartNumberingAfterBreak="0">
+    <w:nsid w:val="70E563F9"/>
+    <w:multiLevelType w:val="multilevel"/>
+    <w:tmpl w:val="22C2CCF2"/>
+    <w:lvl w:ilvl="0">
+      <w:start w:val="1"/>
+      <w:numFmt w:val="bullet"/>
+      <w:lvlText w:val=""/>
+      <w:lvlJc w:val="left"/>
+      <w:pPr>
+        <w:tabs>
+          <w:tab w:val="num" w:pos="720"/>
+        </w:tabs>
+        <w:ind w:left="720" w:hanging="360"/>
+      </w:pPr>
+      <w:rPr>
+        <w:rFonts w:ascii="Symbol" w:hAnsi="Symbol" w:hint="default"/>
+        <w:sz w:val="20"/>
+      </w:rPr>
+    </w:lvl>
+    <w:lvl w:ilvl="1">
+      <w:start w:val="1"/>
+      <w:numFmt w:val="decimal"/>
+      <w:lvlText w:val="%2."/>
+      <w:lvlJc w:val="left"/>
+      <w:pPr>
+        <w:tabs>
+          <w:tab w:val="num" w:pos="1440"/>
+        </w:tabs>
+        <w:ind w:left="1440" w:hanging="360"/>
+      </w:pPr>
+    </w:lvl>
+    <w:lvl w:ilvl="2" w:tentative="1">
+      <w:start w:val="1"/>
+      <w:numFmt w:val="bullet"/>
+      <w:lvlText w:val=""/>
+      <w:lvlJc w:val="left"/>
+      <w:pPr>
+        <w:tabs>
+          <w:tab w:val="num" w:pos="2160"/>
+        </w:tabs>
+        <w:ind w:left="2160" w:hanging="360"/>
+      </w:pPr>
+      <w:rPr>
+        <w:rFonts w:ascii="Wingdings" w:hAnsi="Wingdings" w:hint="default"/>
+        <w:sz w:val="20"/>
+      </w:rPr>
+    </w:lvl>
+    <w:lvl w:ilvl="3" w:tentative="1">
+      <w:start w:val="1"/>
+      <w:numFmt w:val="bullet"/>
+      <w:lvlText w:val=""/>
+      <w:lvlJc w:val="left"/>
+      <w:pPr>
+        <w:tabs>
+          <w:tab w:val="num" w:pos="2880"/>
+        </w:tabs>
+        <w:ind w:left="2880" w:hanging="360"/>
+      </w:pPr>
+      <w:rPr>
+        <w:rFonts w:ascii="Wingdings" w:hAnsi="Wingdings" w:hint="default"/>
+        <w:sz w:val="20"/>
+      </w:rPr>
+    </w:lvl>
+    <w:lvl w:ilvl="4" w:tentative="1">
+      <w:start w:val="1"/>
+      <w:numFmt w:val="bullet"/>
+      <w:lvlText w:val=""/>
+      <w:lvlJc w:val="left"/>
+      <w:pPr>
+        <w:tabs>
+          <w:tab w:val="num" w:pos="3600"/>
+        </w:tabs>
+        <w:ind w:left="3600" w:hanging="360"/>
+      </w:pPr>
+      <w:rPr>
+        <w:rFonts w:ascii="Wingdings" w:hAnsi="Wingdings" w:hint="default"/>
+        <w:sz w:val="20"/>
+      </w:rPr>
+    </w:lvl>
+    <w:lvl w:ilvl="5" w:tentative="1">
+      <w:start w:val="1"/>
+      <w:numFmt w:val="bullet"/>
+      <w:lvlText w:val=""/>
+      <w:lvlJc w:val="left"/>
+      <w:pPr>
+        <w:tabs>
+          <w:tab w:val="num" w:pos="4320"/>
+        </w:tabs>
+        <w:ind w:left="4320" w:hanging="360"/>
+      </w:pPr>
+      <w:rPr>
+        <w:rFonts w:ascii="Wingdings" w:hAnsi="Wingdings" w:hint="default"/>
+        <w:sz w:val="20"/>
+      </w:rPr>
+    </w:lvl>
+    <w:lvl w:ilvl="6" w:tentative="1">
+      <w:start w:val="1"/>
+      <w:numFmt w:val="bullet"/>
+      <w:lvlText w:val=""/>
+      <w:lvlJc w:val="left"/>
+      <w:pPr>
+        <w:tabs>
+          <w:tab w:val="num" w:pos="5040"/>
+        </w:tabs>
+        <w:ind w:left="5040" w:hanging="360"/>
+      </w:pPr>
+      <w:rPr>
+        <w:rFonts w:ascii="Wingdings" w:hAnsi="Wingdings" w:hint="default"/>
+        <w:sz w:val="20"/>
+      </w:rPr>
+    </w:lvl>
+    <w:lvl w:ilvl="7" w:tentative="1">
+      <w:start w:val="1"/>
+      <w:numFmt w:val="bullet"/>
+      <w:lvlText w:val=""/>
+      <w:lvlJc w:val="left"/>
+      <w:pPr>
+        <w:tabs>
+          <w:tab w:val="num" w:pos="5760"/>
+        </w:tabs>
+        <w:ind w:left="5760" w:hanging="360"/>
+      </w:pPr>
+      <w:rPr>
+        <w:rFonts w:ascii="Wingdings" w:hAnsi="Wingdings" w:hint="default"/>
+        <w:sz w:val="20"/>
+      </w:rPr>
+    </w:lvl>
+    <w:lvl w:ilvl="8" w:tentative="1">
+      <w:start w:val="1"/>
+      <w:numFmt w:val="bullet"/>
+      <w:lvlText w:val=""/>
+      <w:lvlJc w:val="left"/>
+      <w:pPr>
+        <w:tabs>
+          <w:tab w:val="num" w:pos="6480"/>
+        </w:tabs>
+        <w:ind w:left="6480" w:hanging="360"/>
+      </w:pPr>
+      <w:rPr>
+        <w:rFonts w:ascii="Wingdings" w:hAnsi="Wingdings" w:hint="default"/>
+        <w:sz w:val="20"/>
+      </w:rPr>
+    </w:lvl>
+  </w:abstractNum>
+  <w:abstractNum w:abstractNumId="18" w15:restartNumberingAfterBreak="0">
     <w:nsid w:val="778D3378"/>
     <w:multiLevelType w:val="multilevel"/>
     <w:tmpl w:val="833E5392"/>
@@ -7013,49 +8650,61 @@
     </w:lvl>
   </w:abstractNum>
   <w:num w:numId="1">
+    <w:abstractNumId w:val="5"/>
+  </w:num>
+  <w:num w:numId="2">
+    <w:abstractNumId w:val="18"/>
+  </w:num>
+  <w:num w:numId="3">
+    <w:abstractNumId w:val="7"/>
+  </w:num>
+  <w:num w:numId="4">
+    <w:abstractNumId w:val="9"/>
+  </w:num>
+  <w:num w:numId="5">
+    <w:abstractNumId w:val="6"/>
+  </w:num>
+  <w:num w:numId="6">
+    <w:abstractNumId w:val="8"/>
+  </w:num>
+  <w:num w:numId="7">
     <w:abstractNumId w:val="3"/>
   </w:num>
-  <w:num w:numId="2">
+  <w:num w:numId="8">
+    <w:abstractNumId w:val="15"/>
+  </w:num>
+  <w:num w:numId="9">
+    <w:abstractNumId w:val="4"/>
+  </w:num>
+  <w:num w:numId="10">
     <w:abstractNumId w:val="14"/>
   </w:num>
-  <w:num w:numId="3">
-    <w:abstractNumId w:val="5"/>
+  <w:num w:numId="11">
+    <w:abstractNumId w:val="12"/>
   </w:num>
-  <w:num w:numId="4">
-    <w:abstractNumId w:val="7"/>
+  <w:num w:numId="12">
+    <w:abstractNumId w:val="10"/>
   </w:num>
-  <w:num w:numId="5">
-    <w:abstractNumId w:val="4"/>
+  <w:num w:numId="13">
+    <w:abstractNumId w:val="2"/>
   </w:num>
-  <w:num w:numId="6">
-    <w:abstractNumId w:val="6"/>
+  <w:num w:numId="14">
+    <w:abstractNumId w:val="11"/>
   </w:num>
-  <w:num w:numId="7">
+  <w:num w:numId="15">
+    <w:abstractNumId w:val="13"/>
+  </w:num>
+  <w:num w:numId="16">
     <w:abstractNumId w:val="1"/>
   </w:num>
-  <w:num w:numId="8">
-    <w:abstractNumId w:val="13"/>
+  <w:num w:numId="17">
+    <w:abstractNumId w:val="16"/>
   </w:num>
-  <w:num w:numId="9">
-    <w:abstractNumId w:val="2"/>
+  <w:num w:numId="18">
+    <w:abstractNumId w:val="17"/>
   </w:num>
-  <w:num w:numId="10">
-    <w:abstractNumId w:val="12"/>
-  </w:num>
-  <w:num w:numId="11">
-    <w:abstractNumId w:val="10"/>
-  </w:num>
-  <w:num w:numId="12">
-    <w:abstractNumId w:val="8"/>
-  </w:num>
-  <w:num w:numId="13">
+  <w:num w:numId="19">
     <w:abstractNumId w:val="0"/>
-  </w:num>
-  <w:num w:numId="14">
-    <w:abstractNumId w:val="9"/>
-  </w:num>
-  <w:num w:numId="15">
-    <w:abstractNumId w:val="11"/>
   </w:num>
 </w:numbering>
 </file>
@@ -7933,6 +9582,106 @@
     <w:basedOn w:val="DefaultParagraphFont"/>
     <w:rsid w:val="00F52B96"/>
   </w:style>
+  <w:style w:type="character" w:customStyle="1" w:styleId="citation-254">
+    <w:name w:val="citation-254"/>
+    <w:basedOn w:val="DefaultParagraphFont"/>
+    <w:rsid w:val="00072102"/>
+  </w:style>
+  <w:style w:type="character" w:customStyle="1" w:styleId="citation-253">
+    <w:name w:val="citation-253"/>
+    <w:basedOn w:val="DefaultParagraphFont"/>
+    <w:rsid w:val="00072102"/>
+  </w:style>
+  <w:style w:type="character" w:customStyle="1" w:styleId="citation-252">
+    <w:name w:val="citation-252"/>
+    <w:basedOn w:val="DefaultParagraphFont"/>
+    <w:rsid w:val="00072102"/>
+  </w:style>
+  <w:style w:type="character" w:customStyle="1" w:styleId="citation-251">
+    <w:name w:val="citation-251"/>
+    <w:basedOn w:val="DefaultParagraphFont"/>
+    <w:rsid w:val="00072102"/>
+  </w:style>
+  <w:style w:type="character" w:customStyle="1" w:styleId="citation-250">
+    <w:name w:val="citation-250"/>
+    <w:basedOn w:val="DefaultParagraphFont"/>
+    <w:rsid w:val="00072102"/>
+  </w:style>
+  <w:style w:type="character" w:customStyle="1" w:styleId="citation-249">
+    <w:name w:val="citation-249"/>
+    <w:basedOn w:val="DefaultParagraphFont"/>
+    <w:rsid w:val="00072102"/>
+  </w:style>
+  <w:style w:type="character" w:customStyle="1" w:styleId="citation-248">
+    <w:name w:val="citation-248"/>
+    <w:basedOn w:val="DefaultParagraphFont"/>
+    <w:rsid w:val="00072102"/>
+  </w:style>
+  <w:style w:type="character" w:customStyle="1" w:styleId="citation-247">
+    <w:name w:val="citation-247"/>
+    <w:basedOn w:val="DefaultParagraphFont"/>
+    <w:rsid w:val="00072102"/>
+  </w:style>
+  <w:style w:type="character" w:customStyle="1" w:styleId="citation-246">
+    <w:name w:val="citation-246"/>
+    <w:basedOn w:val="DefaultParagraphFont"/>
+    <w:rsid w:val="00072102"/>
+  </w:style>
+  <w:style w:type="character" w:customStyle="1" w:styleId="citation-245">
+    <w:name w:val="citation-245"/>
+    <w:basedOn w:val="DefaultParagraphFont"/>
+    <w:rsid w:val="00072102"/>
+  </w:style>
+  <w:style w:type="character" w:customStyle="1" w:styleId="citation-244">
+    <w:name w:val="citation-244"/>
+    <w:basedOn w:val="DefaultParagraphFont"/>
+    <w:rsid w:val="00072102"/>
+  </w:style>
+  <w:style w:type="character" w:customStyle="1" w:styleId="citation-243">
+    <w:name w:val="citation-243"/>
+    <w:basedOn w:val="DefaultParagraphFont"/>
+    <w:rsid w:val="00072102"/>
+  </w:style>
+  <w:style w:type="character" w:customStyle="1" w:styleId="citation-242">
+    <w:name w:val="citation-242"/>
+    <w:basedOn w:val="DefaultParagraphFont"/>
+    <w:rsid w:val="00072102"/>
+  </w:style>
+  <w:style w:type="character" w:customStyle="1" w:styleId="citation-241">
+    <w:name w:val="citation-241"/>
+    <w:basedOn w:val="DefaultParagraphFont"/>
+    <w:rsid w:val="00072102"/>
+  </w:style>
+  <w:style w:type="character" w:customStyle="1" w:styleId="citation-240">
+    <w:name w:val="citation-240"/>
+    <w:basedOn w:val="DefaultParagraphFont"/>
+    <w:rsid w:val="00072102"/>
+  </w:style>
+  <w:style w:type="character" w:customStyle="1" w:styleId="citation-239">
+    <w:name w:val="citation-239"/>
+    <w:basedOn w:val="DefaultParagraphFont"/>
+    <w:rsid w:val="00072102"/>
+  </w:style>
+  <w:style w:type="character" w:customStyle="1" w:styleId="citation-238">
+    <w:name w:val="citation-238"/>
+    <w:basedOn w:val="DefaultParagraphFont"/>
+    <w:rsid w:val="00072102"/>
+  </w:style>
+  <w:style w:type="character" w:customStyle="1" w:styleId="citation-237">
+    <w:name w:val="citation-237"/>
+    <w:basedOn w:val="DefaultParagraphFont"/>
+    <w:rsid w:val="00072102"/>
+  </w:style>
+  <w:style w:type="character" w:customStyle="1" w:styleId="citation-236">
+    <w:name w:val="citation-236"/>
+    <w:basedOn w:val="DefaultParagraphFont"/>
+    <w:rsid w:val="00072102"/>
+  </w:style>
+  <w:style w:type="character" w:customStyle="1" w:styleId="citation-235">
+    <w:name w:val="citation-235"/>
+    <w:basedOn w:val="DefaultParagraphFont"/>
+    <w:rsid w:val="00072102"/>
+  </w:style>
 </w:styles>
 </file>
 

</xml_diff>

<commit_message>
preparing for exam professional practice
</commit_message>
<xml_diff>
--- a/8-semester/professional practice/mid/mid note.docx
+++ b/8-semester/professional practice/mid/mid note.docx
@@ -3459,16 +3459,43 @@
           <w:color w:val="1F1F1F"/>
           <w:sz w:val="24"/>
           <w:szCs w:val="24"/>
-        </w:rPr>
-      </w:pPr>
-      <w:r>
-        <w:rPr>
-          <w:rFonts w:asciiTheme="majorBidi" w:hAnsiTheme="majorBidi" w:cstheme="majorBidi"/>
-          <w:color w:val="1F1F1F"/>
-          <w:sz w:val="24"/>
-          <w:szCs w:val="24"/>
-          <w:bdr w:val="none" w:sz="0" w:space="0" w:color="auto" w:frame="1"/>
-        </w:rPr>
+          <w:bdr w:val="none" w:sz="0" w:space="0" w:color="auto" w:frame="1"/>
+        </w:rPr>
+      </w:pPr>
+    </w:p>
+    <w:p>
+      <w:pPr>
+        <w:pStyle w:val="Heading3"/>
+        <w:spacing w:after="0" w:afterAutospacing="0"/>
+        <w:rPr>
+          <w:rFonts w:asciiTheme="majorBidi" w:hAnsiTheme="majorBidi" w:cstheme="majorBidi"/>
+          <w:color w:val="1F1F1F"/>
+          <w:sz w:val="24"/>
+          <w:szCs w:val="24"/>
+          <w:bdr w:val="none" w:sz="0" w:space="0" w:color="auto" w:frame="1"/>
+        </w:rPr>
+      </w:pPr>
+    </w:p>
+    <w:p>
+      <w:pPr>
+        <w:pStyle w:val="Heading3"/>
+        <w:spacing w:after="0" w:afterAutospacing="0"/>
+        <w:rPr>
+          <w:rFonts w:asciiTheme="majorBidi" w:hAnsiTheme="majorBidi" w:cstheme="majorBidi"/>
+          <w:color w:val="1F1F1F"/>
+          <w:sz w:val="24"/>
+          <w:szCs w:val="24"/>
+        </w:rPr>
+      </w:pPr>
+      <w:r>
+        <w:rPr>
+          <w:rFonts w:asciiTheme="majorBidi" w:hAnsiTheme="majorBidi" w:cstheme="majorBidi"/>
+          <w:color w:val="1F1F1F"/>
+          <w:sz w:val="24"/>
+          <w:szCs w:val="24"/>
+          <w:bdr w:val="none" w:sz="0" w:space="0" w:color="auto" w:frame="1"/>
+        </w:rPr>
+        <w:lastRenderedPageBreak/>
         <w:t>Types of Cybercrime</w:t>
       </w:r>
     </w:p>
@@ -3518,7 +3545,6 @@
           <w:color w:val="1F1F1F"/>
           <w:bdr w:val="none" w:sz="0" w:space="0" w:color="auto" w:frame="1"/>
         </w:rPr>
-        <w:lastRenderedPageBreak/>
         <w:t>Definition:</w:t>
       </w:r>
       <w:r>
@@ -4358,6 +4384,7 @@
           <w:b/>
           <w:bCs/>
         </w:rPr>
+        <w:lastRenderedPageBreak/>
         <w:t>Trojan horse:</w:t>
       </w:r>
       <w:r>
@@ -4419,7 +4446,6 @@
         <w:rPr>
           <w:rFonts w:asciiTheme="majorBidi" w:hAnsiTheme="majorBidi" w:cstheme="majorBidi"/>
         </w:rPr>
-        <w:lastRenderedPageBreak/>
         <w:t>Users might be able to detect malware if they observe unusual activity. Common malware symptoms include the following:</w:t>
       </w:r>
     </w:p>
@@ -6715,15 +6741,7 @@
           <w:sz w:val="24"/>
           <w:szCs w:val="24"/>
         </w:rPr>
-        <w:t>Identity Theft</w:t>
-      </w:r>
-      <w:r>
-        <w:rPr>
-          <w:rFonts w:asciiTheme="majorBidi" w:hAnsiTheme="majorBidi" w:cstheme="majorBidi"/>
-          <w:sz w:val="24"/>
-          <w:szCs w:val="24"/>
-        </w:rPr>
-        <w:t xml:space="preserve">: </w:t>
+        <w:t xml:space="preserve">Identity Theft: </w:t>
       </w:r>
       <w:r>
         <w:rPr>
@@ -6810,25 +6828,7 @@
           <w:szCs w:val="24"/>
           <w:lang w:bidi="ar-SA"/>
         </w:rPr>
-        <w:t xml:space="preserve"> </w:t>
-      </w:r>
-      <w:r>
-        <w:rPr>
-          <w:rFonts w:asciiTheme="majorBidi" w:eastAsia="Times New Roman" w:hAnsiTheme="majorBidi" w:cstheme="majorBidi"/>
-          <w:sz w:val="24"/>
-          <w:szCs w:val="24"/>
-          <w:lang w:bidi="ar-SA"/>
-        </w:rPr>
-        <w:t xml:space="preserve"> P</w:t>
-      </w:r>
-      <w:r>
-        <w:rPr>
-          <w:rFonts w:asciiTheme="majorBidi" w:eastAsia="Times New Roman" w:hAnsiTheme="majorBidi" w:cstheme="majorBidi"/>
-          <w:sz w:val="24"/>
-          <w:szCs w:val="24"/>
-          <w:lang w:bidi="ar-SA"/>
-        </w:rPr>
-        <w:t xml:space="preserve">eople who use computer skills to </w:t>
+        <w:t xml:space="preserve">  People who use computer skills to </w:t>
       </w:r>
       <w:r>
         <w:rPr>
@@ -6926,16 +6926,7 @@
           <w:szCs w:val="24"/>
           <w:lang w:bidi="ar-SA"/>
         </w:rPr>
-        <w:t xml:space="preserve">: </w:t>
-      </w:r>
-      <w:r>
-        <w:rPr>
-          <w:rFonts w:asciiTheme="majorBidi" w:eastAsia="Times New Roman" w:hAnsiTheme="majorBidi" w:cstheme="majorBidi"/>
-          <w:sz w:val="24"/>
-          <w:szCs w:val="24"/>
-          <w:lang w:bidi="ar-SA"/>
-        </w:rPr>
-        <w:t xml:space="preserve">People who use skills for </w:t>
+        <w:t xml:space="preserve">: People who use skills for </w:t>
       </w:r>
       <w:r>
         <w:rPr>
@@ -7028,17 +7019,7 @@
           <w:sz w:val="24"/>
           <w:szCs w:val="24"/>
         </w:rPr>
-        <w:t>Phishing</w:t>
-      </w:r>
-      <w:r>
-        <w:rPr>
-          <w:rFonts w:asciiTheme="majorBidi" w:hAnsiTheme="majorBidi" w:cstheme="majorBidi"/>
-          <w:b/>
-          <w:bCs/>
-          <w:sz w:val="24"/>
-          <w:szCs w:val="24"/>
-        </w:rPr>
-        <w:t xml:space="preserve">: </w:t>
+        <w:t xml:space="preserve">Phishing: </w:t>
       </w:r>
       <w:r>
         <w:rPr>
@@ -7300,18 +7281,7 @@
           <w:szCs w:val="24"/>
           <w:lang w:bidi="ar-SA"/>
         </w:rPr>
-        <w:t>Copyright infringement</w:t>
-      </w:r>
-      <w:r>
-        <w:rPr>
-          <w:rFonts w:asciiTheme="majorBidi" w:eastAsia="Times New Roman" w:hAnsiTheme="majorBidi" w:cstheme="majorBidi"/>
-          <w:b/>
-          <w:bCs/>
-          <w:sz w:val="24"/>
-          <w:szCs w:val="24"/>
-          <w:lang w:bidi="ar-SA"/>
-        </w:rPr>
-        <w:t xml:space="preserve">: </w:t>
+        <w:t xml:space="preserve">Copyright infringement: </w:t>
       </w:r>
       <w:r>
         <w:rPr>
@@ -7610,7 +7580,7 @@
           <w:szCs w:val="24"/>
         </w:rPr>
         <w:pict w14:anchorId="400D65FA">
-          <v:rect id="_x0000_i1030" style="width:0;height:1.5pt" o:hralign="center" o:hrstd="t" o:hr="t" fillcolor="#a0a0a0" stroked="f"/>
+          <v:rect id="_x0000_i1026" style="width:0;height:1.5pt" o:hralign="center" o:hrstd="t" o:hr="t" fillcolor="#a0a0a0" stroked="f"/>
         </w:pict>
       </w:r>
     </w:p>
@@ -7753,7 +7723,7 @@
           <w:szCs w:val="24"/>
         </w:rPr>
         <w:pict w14:anchorId="5D0DF718">
-          <v:rect id="_x0000_i1031" style="width:0;height:1.5pt" o:hralign="center" o:hrstd="t" o:hr="t" fillcolor="#a0a0a0" stroked="f"/>
+          <v:rect id="_x0000_i1027" style="width:0;height:1.5pt" o:hralign="center" o:hrstd="t" o:hr="t" fillcolor="#a0a0a0" stroked="f"/>
         </w:pict>
       </w:r>
     </w:p>
@@ -7846,7 +7816,7 @@
           <w:szCs w:val="24"/>
         </w:rPr>
         <w:pict w14:anchorId="7BCD3FC3">
-          <v:rect id="_x0000_i1032" style="width:0;height:1.5pt" o:hralign="center" o:hrstd="t" o:hr="t" fillcolor="#a0a0a0" stroked="f"/>
+          <v:rect id="_x0000_i1028" style="width:0;height:1.5pt" o:hralign="center" o:hrstd="t" o:hr="t" fillcolor="#a0a0a0" stroked="f"/>
         </w:pict>
       </w:r>
     </w:p>
@@ -7997,7 +7967,7 @@
           <w:szCs w:val="24"/>
         </w:rPr>
         <w:pict w14:anchorId="0C141933">
-          <v:rect id="_x0000_i1033" style="width:0;height:1.5pt" o:hralign="center" o:hrstd="t" o:hr="t" fillcolor="#a0a0a0" stroked="f"/>
+          <v:rect id="_x0000_i1029" style="width:0;height:1.5pt" o:hralign="center" o:hrstd="t" o:hr="t" fillcolor="#a0a0a0" stroked="f"/>
         </w:pict>
       </w:r>
     </w:p>
@@ -8136,7 +8106,7 @@
         </w:rPr>
         <w:lastRenderedPageBreak/>
         <w:pict w14:anchorId="7A1768A7">
-          <v:rect id="_x0000_i1034" style="width:0;height:1.5pt" o:hralign="center" o:hrstd="t" o:hr="t" fillcolor="#a0a0a0" stroked="f"/>
+          <v:rect id="_x0000_i1030" style="width:0;height:1.5pt" o:hralign="center" o:hrstd="t" o:hr="t" fillcolor="#a0a0a0" stroked="f"/>
         </w:pict>
       </w:r>
     </w:p>
@@ -8244,7 +8214,7 @@
           <w:szCs w:val="24"/>
         </w:rPr>
         <w:pict w14:anchorId="6F16D889">
-          <v:rect id="_x0000_i1035" style="width:0;height:1.5pt" o:hralign="center" o:hrstd="t" o:hr="t" fillcolor="#a0a0a0" stroked="f"/>
+          <v:rect id="_x0000_i1031" style="width:0;height:1.5pt" o:hralign="center" o:hrstd="t" o:hr="t" fillcolor="#a0a0a0" stroked="f"/>
         </w:pict>
       </w:r>
     </w:p>
@@ -8467,7 +8437,7 @@
           <w:szCs w:val="24"/>
         </w:rPr>
         <w:pict w14:anchorId="22A76094">
-          <v:rect id="_x0000_i1156" style="width:0;height:1.5pt" o:hrstd="t" o:hr="t" fillcolor="#a0a0a0" stroked="f"/>
+          <v:rect id="_x0000_i1032" style="width:0;height:1.5pt" o:hrstd="t" o:hr="t" fillcolor="#a0a0a0" stroked="f"/>
         </w:pict>
       </w:r>
     </w:p>
@@ -8607,7 +8577,7 @@
           <w:szCs w:val="24"/>
         </w:rPr>
         <w:pict w14:anchorId="0A30D22E">
-          <v:rect id="_x0000_i1157" style="width:0;height:1.5pt" o:hrstd="t" o:hr="t" fillcolor="#a0a0a0" stroked="f"/>
+          <v:rect id="_x0000_i1033" style="width:0;height:1.5pt" o:hrstd="t" o:hr="t" fillcolor="#a0a0a0" stroked="f"/>
         </w:pict>
       </w:r>
     </w:p>
@@ -8824,7 +8794,7 @@
           <w:szCs w:val="24"/>
         </w:rPr>
         <w:pict w14:anchorId="0DFBDBF9">
-          <v:rect id="_x0000_i1158" style="width:0;height:1.5pt" o:hrstd="t" o:hr="t" fillcolor="#a0a0a0" stroked="f"/>
+          <v:rect id="_x0000_i1034" style="width:0;height:1.5pt" o:hrstd="t" o:hr="t" fillcolor="#a0a0a0" stroked="f"/>
         </w:pict>
       </w:r>
     </w:p>
@@ -8959,7 +8929,7 @@
           <w:szCs w:val="24"/>
         </w:rPr>
         <w:pict w14:anchorId="123287D9">
-          <v:rect id="_x0000_i1159" style="width:0;height:1.5pt" o:hrstd="t" o:hr="t" fillcolor="#a0a0a0" stroked="f"/>
+          <v:rect id="_x0000_i1035" style="width:0;height:1.5pt" o:hrstd="t" o:hr="t" fillcolor="#a0a0a0" stroked="f"/>
         </w:pict>
       </w:r>
     </w:p>
@@ -9119,7 +9089,7 @@
           <w:szCs w:val="24"/>
         </w:rPr>
         <w:pict w14:anchorId="37923FA3">
-          <v:rect id="_x0000_i1160" style="width:0;height:1.5pt" o:hrstd="t" o:hr="t" fillcolor="#a0a0a0" stroked="f"/>
+          <v:rect id="_x0000_i1036" style="width:0;height:1.5pt" o:hrstd="t" o:hr="t" fillcolor="#a0a0a0" stroked="f"/>
         </w:pict>
       </w:r>
     </w:p>
@@ -9221,7 +9191,7 @@
           <w:szCs w:val="24"/>
         </w:rPr>
         <w:pict w14:anchorId="00A025B6">
-          <v:rect id="_x0000_i1161" style="width:0;height:1.5pt" o:hrstd="t" o:hr="t" fillcolor="#a0a0a0" stroked="f"/>
+          <v:rect id="_x0000_i1037" style="width:0;height:1.5pt" o:hrstd="t" o:hr="t" fillcolor="#a0a0a0" stroked="f"/>
         </w:pict>
       </w:r>
     </w:p>

</xml_diff>